<commit_message>
spring boot mokito example
</commit_message>
<xml_diff>
--- a/10096255_Day11.docx
+++ b/10096255_Day11.docx
@@ -2465,12 +2465,2423 @@
       </w:r>
     </w:p>
     <w:p>
+      <w:pPr>
+        <w:rPr>
+          <w:b/>
+          <w:bCs/>
+        </w:rPr>
+      </w:pPr>
       <w:r>
         <w:t>Response</w:t>
+      </w:r>
+      <w:r>
+        <w:br/>
+      </w:r>
+      <w:r>
+        <w:br/>
+      </w:r>
+      <w:r>
+        <w:rPr>
+          <w:b/>
+          <w:bCs/>
+        </w:rPr>
+        <w:t xml:space="preserve">Task 17: What are the advantages of using </w:t>
+      </w:r>
+      <w:proofErr w:type="spellStart"/>
+      <w:r>
+        <w:rPr>
+          <w:b/>
+          <w:bCs/>
+        </w:rPr>
+        <w:t>Thymeleaf</w:t>
+      </w:r>
+      <w:proofErr w:type="spellEnd"/>
+      <w:r>
+        <w:rPr>
+          <w:b/>
+          <w:bCs/>
+        </w:rPr>
+        <w:t>?</w:t>
+      </w:r>
+    </w:p>
+    <w:p>
+      <w:proofErr w:type="spellStart"/>
+      <w:r>
+        <w:rPr>
+          <w:b/>
+          <w:bCs/>
+        </w:rPr>
+        <w:t>Thymeleaf</w:t>
+      </w:r>
+      <w:proofErr w:type="spellEnd"/>
+      <w:r>
+        <w:t xml:space="preserve"> is a modern Java template engine used with Spring Boot to create dynamic web pages.</w:t>
+      </w:r>
+    </w:p>
+    <w:p>
+      <w:pPr>
+        <w:rPr>
+          <w:b/>
+          <w:bCs/>
+        </w:rPr>
+      </w:pPr>
+      <w:r>
+        <w:rPr>
+          <w:b/>
+          <w:bCs/>
+        </w:rPr>
+        <w:t>Advantages</w:t>
+      </w:r>
+    </w:p>
+    <w:p>
+      <w:pPr>
+        <w:numPr>
+          <w:ilvl w:val="0"/>
+          <w:numId w:val="1"/>
+        </w:numPr>
+      </w:pPr>
+      <w:r>
+        <w:rPr>
+          <w:b/>
+          <w:bCs/>
+        </w:rPr>
+        <w:t>Easy Integration with Spring Boot</w:t>
+      </w:r>
+      <w:r>
+        <w:t xml:space="preserve"> </w:t>
+      </w:r>
+    </w:p>
+    <w:p>
+      <w:pPr>
+        <w:numPr>
+          <w:ilvl w:val="1"/>
+          <w:numId w:val="1"/>
+        </w:numPr>
+      </w:pPr>
+      <w:r>
+        <w:t xml:space="preserve">Integrates seamlessly with Spring MVC and Spring Boot. </w:t>
+      </w:r>
+    </w:p>
+    <w:p>
+      <w:pPr>
+        <w:numPr>
+          <w:ilvl w:val="0"/>
+          <w:numId w:val="1"/>
+        </w:numPr>
+      </w:pPr>
+      <w:r>
+        <w:rPr>
+          <w:b/>
+          <w:bCs/>
+        </w:rPr>
+        <w:t>Natural Templates</w:t>
+      </w:r>
+      <w:r>
+        <w:t xml:space="preserve"> </w:t>
+      </w:r>
+    </w:p>
+    <w:p>
+      <w:pPr>
+        <w:numPr>
+          <w:ilvl w:val="1"/>
+          <w:numId w:val="1"/>
+        </w:numPr>
+      </w:pPr>
+      <w:r>
+        <w:t xml:space="preserve">HTML files can be opened directly in a browser without running the application. </w:t>
+      </w:r>
+    </w:p>
+    <w:p>
+      <w:pPr>
+        <w:numPr>
+          <w:ilvl w:val="0"/>
+          <w:numId w:val="1"/>
+        </w:numPr>
+      </w:pPr>
+      <w:r>
+        <w:rPr>
+          <w:b/>
+          <w:bCs/>
+        </w:rPr>
+        <w:t>Supports Dynamic Data</w:t>
+      </w:r>
+      <w:r>
+        <w:t xml:space="preserve"> </w:t>
+      </w:r>
+    </w:p>
+    <w:p>
+      <w:pPr>
+        <w:numPr>
+          <w:ilvl w:val="1"/>
+          <w:numId w:val="1"/>
+        </w:numPr>
+      </w:pPr>
+      <w:r>
+        <w:t xml:space="preserve">Displays data from the server using expressions like ${user.name}. </w:t>
+      </w:r>
+    </w:p>
+    <w:p>
+      <w:pPr>
+        <w:numPr>
+          <w:ilvl w:val="0"/>
+          <w:numId w:val="1"/>
+        </w:numPr>
+      </w:pPr>
+      <w:r>
+        <w:rPr>
+          <w:b/>
+          <w:bCs/>
+        </w:rPr>
+        <w:t>Easy to Learn</w:t>
+      </w:r>
+      <w:r>
+        <w:t xml:space="preserve"> </w:t>
+      </w:r>
+    </w:p>
+    <w:p>
+      <w:pPr>
+        <w:numPr>
+          <w:ilvl w:val="1"/>
+          <w:numId w:val="1"/>
+        </w:numPr>
+      </w:pPr>
+      <w:r>
+        <w:t xml:space="preserve">Uses standard HTML with simple attributes. </w:t>
+      </w:r>
+    </w:p>
+    <w:p>
+      <w:pPr>
+        <w:numPr>
+          <w:ilvl w:val="0"/>
+          <w:numId w:val="1"/>
+        </w:numPr>
+      </w:pPr>
+      <w:r>
+        <w:rPr>
+          <w:b/>
+          <w:bCs/>
+        </w:rPr>
+        <w:t>Reusable Layouts</w:t>
+      </w:r>
+      <w:r>
+        <w:t xml:space="preserve"> </w:t>
+      </w:r>
+    </w:p>
+    <w:p>
+      <w:pPr>
+        <w:numPr>
+          <w:ilvl w:val="1"/>
+          <w:numId w:val="1"/>
+        </w:numPr>
+      </w:pPr>
+      <w:r>
+        <w:t xml:space="preserve">Supports fragments and template inheritance for reusable headers, footers, and menus. </w:t>
+      </w:r>
+    </w:p>
+    <w:p>
+      <w:pPr>
+        <w:numPr>
+          <w:ilvl w:val="0"/>
+          <w:numId w:val="1"/>
+        </w:numPr>
+      </w:pPr>
+      <w:r>
+        <w:rPr>
+          <w:b/>
+          <w:bCs/>
+        </w:rPr>
+        <w:t>Secure</w:t>
+      </w:r>
+      <w:r>
+        <w:t xml:space="preserve"> </w:t>
+      </w:r>
+    </w:p>
+    <w:p>
+      <w:pPr>
+        <w:numPr>
+          <w:ilvl w:val="1"/>
+          <w:numId w:val="1"/>
+        </w:numPr>
+      </w:pPr>
+      <w:r>
+        <w:lastRenderedPageBreak/>
+        <w:t xml:space="preserve">Automatically escapes HTML, reducing Cross-Site Scripting (XSS) attacks. </w:t>
+      </w:r>
+    </w:p>
+    <w:p>
+      <w:pPr>
+        <w:numPr>
+          <w:ilvl w:val="0"/>
+          <w:numId w:val="1"/>
+        </w:numPr>
+      </w:pPr>
+      <w:r>
+        <w:rPr>
+          <w:b/>
+          <w:bCs/>
+        </w:rPr>
+        <w:t>Form Handling</w:t>
+      </w:r>
+      <w:r>
+        <w:t xml:space="preserve"> </w:t>
+      </w:r>
+    </w:p>
+    <w:p>
+      <w:pPr>
+        <w:numPr>
+          <w:ilvl w:val="1"/>
+          <w:numId w:val="1"/>
+        </w:numPr>
+      </w:pPr>
+      <w:r>
+        <w:t xml:space="preserve">Simplifies creating and validating forms. </w:t>
+      </w:r>
+    </w:p>
+    <w:p>
+      <w:pPr>
+        <w:numPr>
+          <w:ilvl w:val="0"/>
+          <w:numId w:val="1"/>
+        </w:numPr>
+      </w:pPr>
+      <w:r>
+        <w:rPr>
+          <w:b/>
+          <w:bCs/>
+        </w:rPr>
+        <w:t>Internationalization (i18n)</w:t>
+      </w:r>
+      <w:r>
+        <w:t xml:space="preserve"> </w:t>
+      </w:r>
+    </w:p>
+    <w:p>
+      <w:pPr>
+        <w:numPr>
+          <w:ilvl w:val="1"/>
+          <w:numId w:val="1"/>
+        </w:numPr>
+      </w:pPr>
+      <w:r>
+        <w:t xml:space="preserve">Supports multiple languages through message resource files. </w:t>
+      </w:r>
+    </w:p>
+    <w:p>
+      <w:pPr>
+        <w:numPr>
+          <w:ilvl w:val="0"/>
+          <w:numId w:val="1"/>
+        </w:numPr>
+      </w:pPr>
+      <w:r>
+        <w:rPr>
+          <w:b/>
+          <w:bCs/>
+        </w:rPr>
+        <w:t>Good IDE Support</w:t>
+      </w:r>
+      <w:r>
+        <w:t xml:space="preserve"> </w:t>
+      </w:r>
+    </w:p>
+    <w:p>
+      <w:pPr>
+        <w:numPr>
+          <w:ilvl w:val="1"/>
+          <w:numId w:val="1"/>
+        </w:numPr>
+      </w:pPr>
+      <w:r>
+        <w:t xml:space="preserve">HTML templates are easy to edit in any HTML editor. </w:t>
+      </w:r>
+    </w:p>
+    <w:p>
+      <w:pPr>
+        <w:numPr>
+          <w:ilvl w:val="0"/>
+          <w:numId w:val="1"/>
+        </w:numPr>
+      </w:pPr>
+      <w:r>
+        <w:rPr>
+          <w:b/>
+          <w:bCs/>
+        </w:rPr>
+        <w:t>Open Source</w:t>
+      </w:r>
+      <w:r>
+        <w:t xml:space="preserve"> </w:t>
+      </w:r>
+    </w:p>
+    <w:p>
+      <w:pPr>
+        <w:numPr>
+          <w:ilvl w:val="1"/>
+          <w:numId w:val="1"/>
+        </w:numPr>
+      </w:pPr>
+      <w:r>
+        <w:t xml:space="preserve">Free to use with active community support. </w:t>
+      </w:r>
+    </w:p>
+    <w:p>
+      <w:r>
+        <w:pict w14:anchorId="3E5E3CDA">
+          <v:rect id="_x0000_i1031" style="width:0;height:1.5pt" o:hralign="center" o:hrstd="t" o:hr="t" fillcolor="#a0a0a0" stroked="f"/>
+        </w:pict>
+      </w:r>
+    </w:p>
+    <w:p>
+      <w:pPr>
+        <w:rPr>
+          <w:b/>
+          <w:bCs/>
+        </w:rPr>
+      </w:pPr>
+      <w:r>
+        <w:rPr>
+          <w:b/>
+          <w:bCs/>
+        </w:rPr>
+        <w:t>Task 18: What is Caching in Spring Boot?</w:t>
+      </w:r>
+    </w:p>
+    <w:p>
+      <w:r>
+        <w:rPr>
+          <w:b/>
+          <w:bCs/>
+        </w:rPr>
+        <w:t>Caching</w:t>
+      </w:r>
+      <w:r>
+        <w:t xml:space="preserve"> is a technique used to store frequently accessed data in temporary memory so future requests can retrieve it faster instead of repeatedly accessing the database or performing expensive computations.</w:t>
+      </w:r>
+    </w:p>
+    <w:p>
+      <w:pPr>
+        <w:rPr>
+          <w:b/>
+          <w:bCs/>
+        </w:rPr>
+      </w:pPr>
+      <w:r>
+        <w:rPr>
+          <w:b/>
+          <w:bCs/>
+        </w:rPr>
+        <w:t>Benefits</w:t>
+      </w:r>
+    </w:p>
+    <w:p>
+      <w:pPr>
+        <w:numPr>
+          <w:ilvl w:val="0"/>
+          <w:numId w:val="2"/>
+        </w:numPr>
+      </w:pPr>
+      <w:r>
+        <w:t xml:space="preserve">Improves application performance. </w:t>
+      </w:r>
+    </w:p>
+    <w:p>
+      <w:pPr>
+        <w:numPr>
+          <w:ilvl w:val="0"/>
+          <w:numId w:val="2"/>
+        </w:numPr>
+      </w:pPr>
+      <w:r>
+        <w:t xml:space="preserve">Reduces database load. </w:t>
+      </w:r>
+    </w:p>
+    <w:p>
+      <w:pPr>
+        <w:numPr>
+          <w:ilvl w:val="0"/>
+          <w:numId w:val="2"/>
+        </w:numPr>
+      </w:pPr>
+      <w:r>
+        <w:t xml:space="preserve">Decreases response time. </w:t>
+      </w:r>
+    </w:p>
+    <w:p>
+      <w:pPr>
+        <w:numPr>
+          <w:ilvl w:val="0"/>
+          <w:numId w:val="2"/>
+        </w:numPr>
+      </w:pPr>
+      <w:r>
+        <w:t xml:space="preserve">Enhances user experience. </w:t>
+      </w:r>
+    </w:p>
+    <w:p>
+      <w:pPr>
+        <w:numPr>
+          <w:ilvl w:val="0"/>
+          <w:numId w:val="2"/>
+        </w:numPr>
+      </w:pPr>
+      <w:r>
+        <w:t xml:space="preserve">Saves computational resources. </w:t>
+      </w:r>
+    </w:p>
+    <w:p>
+      <w:pPr>
+        <w:rPr>
+          <w:b/>
+          <w:bCs/>
+        </w:rPr>
+      </w:pPr>
+      <w:r>
+        <w:rPr>
+          <w:b/>
+          <w:bCs/>
+        </w:rPr>
+        <w:t>How it works</w:t>
+      </w:r>
+    </w:p>
+    <w:p>
+      <w:pPr>
+        <w:numPr>
+          <w:ilvl w:val="0"/>
+          <w:numId w:val="3"/>
+        </w:numPr>
+      </w:pPr>
+      <w:r>
+        <w:t xml:space="preserve">User requests data. </w:t>
+      </w:r>
+    </w:p>
+    <w:p>
+      <w:pPr>
+        <w:numPr>
+          <w:ilvl w:val="0"/>
+          <w:numId w:val="3"/>
+        </w:numPr>
+      </w:pPr>
+      <w:r>
+        <w:t xml:space="preserve">Spring checks if data exists in cache. </w:t>
+      </w:r>
+    </w:p>
+    <w:p>
+      <w:pPr>
+        <w:numPr>
+          <w:ilvl w:val="0"/>
+          <w:numId w:val="3"/>
+        </w:numPr>
+      </w:pPr>
+      <w:r>
+        <w:t>If found (</w:t>
+      </w:r>
+      <w:r>
+        <w:rPr>
+          <w:b/>
+          <w:bCs/>
+        </w:rPr>
+        <w:t>Cache Hit</w:t>
+      </w:r>
+      <w:r>
+        <w:t xml:space="preserve">), it returns cached data. </w:t>
+      </w:r>
+    </w:p>
+    <w:p>
+      <w:pPr>
+        <w:numPr>
+          <w:ilvl w:val="0"/>
+          <w:numId w:val="3"/>
+        </w:numPr>
+      </w:pPr>
+      <w:r>
+        <w:t>If not found (</w:t>
+      </w:r>
+      <w:r>
+        <w:rPr>
+          <w:b/>
+          <w:bCs/>
+        </w:rPr>
+        <w:t>Cache Miss</w:t>
+      </w:r>
+      <w:r>
+        <w:t>), data is fetched from the database and stored in the cache for future use.</w:t>
       </w:r>
     </w:p>
     <w:p/>
     <w:p/>
+    <w:p/>
+    <w:p>
+      <w:pPr>
+        <w:rPr>
+          <w:b/>
+          <w:bCs/>
+        </w:rPr>
+      </w:pPr>
+      <w:r>
+        <w:rPr>
+          <w:b/>
+          <w:bCs/>
+        </w:rPr>
+        <w:lastRenderedPageBreak/>
+        <w:t xml:space="preserve">Task 19: </w:t>
+      </w:r>
+      <w:r>
+        <w:rPr>
+          <w:b/>
+          <w:bCs/>
+        </w:rPr>
+        <w:t xml:space="preserve">What are the features of caching in </w:t>
+      </w:r>
+      <w:proofErr w:type="spellStart"/>
+      <w:r>
+        <w:rPr>
+          <w:b/>
+          <w:bCs/>
+        </w:rPr>
+        <w:t>SpringBoot</w:t>
+      </w:r>
+      <w:proofErr w:type="spellEnd"/>
+      <w:r>
+        <w:rPr>
+          <w:b/>
+          <w:bCs/>
+        </w:rPr>
+        <w:t>?</w:t>
+      </w:r>
+    </w:p>
+    <w:p>
+      <w:pPr>
+        <w:rPr>
+          <w:b/>
+          <w:bCs/>
+        </w:rPr>
+      </w:pPr>
+      <w:r>
+        <w:rPr>
+          <w:b/>
+          <w:bCs/>
+        </w:rPr>
+        <w:t>Features of Caching in Spring Boot</w:t>
+      </w:r>
+    </w:p>
+    <w:p>
+      <w:r>
+        <w:t>Spring Boot provides built-in support for caching, making applications faster and more efficient. Here are its main features:</w:t>
+      </w:r>
+    </w:p>
+    <w:p>
+      <w:pPr>
+        <w:numPr>
+          <w:ilvl w:val="0"/>
+          <w:numId w:val="11"/>
+        </w:numPr>
+      </w:pPr>
+      <w:r>
+        <w:rPr>
+          <w:b/>
+          <w:bCs/>
+        </w:rPr>
+        <w:t>Improves Performance</w:t>
+      </w:r>
+      <w:r>
+        <w:t xml:space="preserve"> </w:t>
+      </w:r>
+    </w:p>
+    <w:p>
+      <w:pPr>
+        <w:numPr>
+          <w:ilvl w:val="1"/>
+          <w:numId w:val="11"/>
+        </w:numPr>
+      </w:pPr>
+      <w:r>
+        <w:t xml:space="preserve">Frequently used data is stored in the cache, reducing the need to access the database repeatedly. </w:t>
+      </w:r>
+    </w:p>
+    <w:p>
+      <w:pPr>
+        <w:numPr>
+          <w:ilvl w:val="0"/>
+          <w:numId w:val="11"/>
+        </w:numPr>
+      </w:pPr>
+      <w:r>
+        <w:rPr>
+          <w:b/>
+          <w:bCs/>
+        </w:rPr>
+        <w:t>Faster Response Time</w:t>
+      </w:r>
+      <w:r>
+        <w:t xml:space="preserve"> </w:t>
+      </w:r>
+    </w:p>
+    <w:p>
+      <w:pPr>
+        <w:numPr>
+          <w:ilvl w:val="1"/>
+          <w:numId w:val="11"/>
+        </w:numPr>
+      </w:pPr>
+      <w:r>
+        <w:t xml:space="preserve">Data is returned directly from the cache, making the application respond more quickly. </w:t>
+      </w:r>
+    </w:p>
+    <w:p>
+      <w:pPr>
+        <w:numPr>
+          <w:ilvl w:val="0"/>
+          <w:numId w:val="11"/>
+        </w:numPr>
+      </w:pPr>
+      <w:r>
+        <w:rPr>
+          <w:b/>
+          <w:bCs/>
+        </w:rPr>
+        <w:t>Reduces Database Load</w:t>
+      </w:r>
+      <w:r>
+        <w:t xml:space="preserve"> </w:t>
+      </w:r>
+    </w:p>
+    <w:p>
+      <w:pPr>
+        <w:numPr>
+          <w:ilvl w:val="1"/>
+          <w:numId w:val="11"/>
+        </w:numPr>
+      </w:pPr>
+      <w:r>
+        <w:t xml:space="preserve">Since repeated database queries are avoided, the database experiences less traffic. </w:t>
+      </w:r>
+    </w:p>
+    <w:p>
+      <w:pPr>
+        <w:numPr>
+          <w:ilvl w:val="0"/>
+          <w:numId w:val="11"/>
+        </w:numPr>
+      </w:pPr>
+      <w:r>
+        <w:rPr>
+          <w:b/>
+          <w:bCs/>
+        </w:rPr>
+        <w:t>Easy to Enable</w:t>
+      </w:r>
+      <w:r>
+        <w:t xml:space="preserve"> </w:t>
+      </w:r>
+    </w:p>
+    <w:p>
+      <w:pPr>
+        <w:numPr>
+          <w:ilvl w:val="1"/>
+          <w:numId w:val="11"/>
+        </w:numPr>
+      </w:pPr>
+      <w:r>
+        <w:t xml:space="preserve">Caching can be enabled simply by using the @EnableCaching annotation. </w:t>
+      </w:r>
+    </w:p>
+    <w:p>
+      <w:pPr>
+        <w:numPr>
+          <w:ilvl w:val="0"/>
+          <w:numId w:val="11"/>
+        </w:numPr>
+      </w:pPr>
+      <w:r>
+        <w:rPr>
+          <w:b/>
+          <w:bCs/>
+        </w:rPr>
+        <w:t>Annotation-Based Configuration</w:t>
+      </w:r>
+      <w:r>
+        <w:t xml:space="preserve"> </w:t>
+      </w:r>
+    </w:p>
+    <w:p>
+      <w:pPr>
+        <w:numPr>
+          <w:ilvl w:val="1"/>
+          <w:numId w:val="11"/>
+        </w:numPr>
+      </w:pPr>
+      <w:r>
+        <w:t xml:space="preserve">Spring Boot provides annotations like @Cacheable, @CachePut, and @CacheEvict to manage caching with minimal code. </w:t>
+      </w:r>
+    </w:p>
+    <w:p>
+      <w:pPr>
+        <w:numPr>
+          <w:ilvl w:val="0"/>
+          <w:numId w:val="11"/>
+        </w:numPr>
+      </w:pPr>
+      <w:r>
+        <w:rPr>
+          <w:b/>
+          <w:bCs/>
+        </w:rPr>
+        <w:t>Supports Multiple Cache Providers</w:t>
+      </w:r>
+      <w:r>
+        <w:t xml:space="preserve"> </w:t>
+      </w:r>
+    </w:p>
+    <w:p>
+      <w:pPr>
+        <w:numPr>
+          <w:ilvl w:val="1"/>
+          <w:numId w:val="11"/>
+        </w:numPr>
+      </w:pPr>
+      <w:r>
+        <w:t xml:space="preserve">Spring Boot works with different caching technologies such as </w:t>
+      </w:r>
+      <w:r>
+        <w:rPr>
+          <w:b/>
+          <w:bCs/>
+        </w:rPr>
+        <w:t>Caffeine</w:t>
+      </w:r>
+      <w:r>
+        <w:t xml:space="preserve">, </w:t>
+      </w:r>
+      <w:proofErr w:type="spellStart"/>
+      <w:r>
+        <w:rPr>
+          <w:b/>
+          <w:bCs/>
+        </w:rPr>
+        <w:t>Ehcache</w:t>
+      </w:r>
+      <w:proofErr w:type="spellEnd"/>
+      <w:r>
+        <w:t xml:space="preserve">, </w:t>
+      </w:r>
+      <w:r>
+        <w:rPr>
+          <w:b/>
+          <w:bCs/>
+        </w:rPr>
+        <w:t>Redis</w:t>
+      </w:r>
+      <w:r>
+        <w:t xml:space="preserve">, </w:t>
+      </w:r>
+      <w:proofErr w:type="spellStart"/>
+      <w:r>
+        <w:rPr>
+          <w:b/>
+          <w:bCs/>
+        </w:rPr>
+        <w:t>Hazelcast</w:t>
+      </w:r>
+      <w:proofErr w:type="spellEnd"/>
+      <w:r>
+        <w:t xml:space="preserve">, and others. </w:t>
+      </w:r>
+    </w:p>
+    <w:p>
+      <w:pPr>
+        <w:numPr>
+          <w:ilvl w:val="0"/>
+          <w:numId w:val="11"/>
+        </w:numPr>
+      </w:pPr>
+      <w:r>
+        <w:rPr>
+          <w:b/>
+          <w:bCs/>
+        </w:rPr>
+        <w:t>Automatic Cache Management</w:t>
+      </w:r>
+      <w:r>
+        <w:t xml:space="preserve"> </w:t>
+      </w:r>
+    </w:p>
+    <w:p>
+      <w:pPr>
+        <w:numPr>
+          <w:ilvl w:val="1"/>
+          <w:numId w:val="11"/>
+        </w:numPr>
+      </w:pPr>
+      <w:r>
+        <w:t xml:space="preserve">Spring Boot automatically checks whether the requested data is available in the cache before calling the actual method. </w:t>
+      </w:r>
+    </w:p>
+    <w:p>
+      <w:pPr>
+        <w:numPr>
+          <w:ilvl w:val="0"/>
+          <w:numId w:val="11"/>
+        </w:numPr>
+      </w:pPr>
+      <w:r>
+        <w:rPr>
+          <w:b/>
+          <w:bCs/>
+        </w:rPr>
+        <w:t>Supports Distributed Caching</w:t>
+      </w:r>
+      <w:r>
+        <w:t xml:space="preserve"> </w:t>
+      </w:r>
+    </w:p>
+    <w:p>
+      <w:pPr>
+        <w:numPr>
+          <w:ilvl w:val="1"/>
+          <w:numId w:val="11"/>
+        </w:numPr>
+      </w:pPr>
+      <w:r>
+        <w:t xml:space="preserve">It can use distributed cache providers like </w:t>
+      </w:r>
+      <w:r>
+        <w:rPr>
+          <w:b/>
+          <w:bCs/>
+        </w:rPr>
+        <w:t>Redis</w:t>
+      </w:r>
+      <w:r>
+        <w:t xml:space="preserve">, allowing multiple application instances to share the same cached data. </w:t>
+      </w:r>
+    </w:p>
+    <w:p>
+      <w:pPr>
+        <w:numPr>
+          <w:ilvl w:val="0"/>
+          <w:numId w:val="11"/>
+        </w:numPr>
+      </w:pPr>
+      <w:r>
+        <w:rPr>
+          <w:b/>
+          <w:bCs/>
+        </w:rPr>
+        <w:t>Easy Cache Updates and Removal</w:t>
+      </w:r>
+      <w:r>
+        <w:t xml:space="preserve"> </w:t>
+      </w:r>
+    </w:p>
+    <w:p>
+      <w:pPr>
+        <w:numPr>
+          <w:ilvl w:val="1"/>
+          <w:numId w:val="11"/>
+        </w:numPr>
+      </w:pPr>
+      <w:r>
+        <w:t xml:space="preserve">Cached data can be updated or removed using annotations like @CachePut and @CacheEvict. </w:t>
+      </w:r>
+    </w:p>
+    <w:p>
+      <w:pPr>
+        <w:numPr>
+          <w:ilvl w:val="0"/>
+          <w:numId w:val="11"/>
+        </w:numPr>
+      </w:pPr>
+      <w:r>
+        <w:rPr>
+          <w:b/>
+          <w:bCs/>
+        </w:rPr>
+        <w:lastRenderedPageBreak/>
+        <w:t>Reduces Resource Usage</w:t>
+      </w:r>
+      <w:r>
+        <w:t xml:space="preserve"> </w:t>
+      </w:r>
+    </w:p>
+    <w:p>
+      <w:pPr>
+        <w:numPr>
+          <w:ilvl w:val="1"/>
+          <w:numId w:val="11"/>
+        </w:numPr>
+      </w:pPr>
+      <w:r>
+        <w:t>By avoiding repeated calculations and database calls, caching saves CPU, memory, and database resources.</w:t>
+      </w:r>
+    </w:p>
+    <w:p>
+      <w:r>
+        <w:pict w14:anchorId="4C89E783">
+          <v:rect id="_x0000_i1075" style="width:0;height:1.5pt" o:hralign="center" o:hrstd="t" o:hr="t" fillcolor="#a0a0a0" stroked="f"/>
+        </w:pict>
+      </w:r>
+    </w:p>
+    <w:p>
+      <w:pPr>
+        <w:rPr>
+          <w:b/>
+          <w:bCs/>
+        </w:rPr>
+      </w:pPr>
+      <w:r>
+        <w:rPr>
+          <w:b/>
+          <w:bCs/>
+        </w:rPr>
+        <w:t>Task 20: What are the types of Caching? Explain each type.</w:t>
+      </w:r>
+    </w:p>
+    <w:p>
+      <w:pPr>
+        <w:rPr>
+          <w:b/>
+          <w:bCs/>
+        </w:rPr>
+      </w:pPr>
+      <w:r>
+        <w:rPr>
+          <w:b/>
+          <w:bCs/>
+        </w:rPr>
+        <w:t>1. In-Memory Cache</w:t>
+      </w:r>
+    </w:p>
+    <w:p>
+      <w:r>
+        <w:t>Stores data in the application's memory (RAM).</w:t>
+      </w:r>
+    </w:p>
+    <w:p>
+      <w:pPr>
+        <w:numPr>
+          <w:ilvl w:val="0"/>
+          <w:numId w:val="5"/>
+        </w:numPr>
+      </w:pPr>
+      <w:r>
+        <w:t xml:space="preserve">Very fast. </w:t>
+      </w:r>
+    </w:p>
+    <w:p>
+      <w:pPr>
+        <w:numPr>
+          <w:ilvl w:val="0"/>
+          <w:numId w:val="5"/>
+        </w:numPr>
+      </w:pPr>
+      <w:r>
+        <w:t xml:space="preserve">Data is lost when the application stops. </w:t>
+      </w:r>
+    </w:p>
+    <w:p>
+      <w:r>
+        <w:rPr>
+          <w:b/>
+          <w:bCs/>
+        </w:rPr>
+        <w:t>Example:</w:t>
+      </w:r>
+      <w:r>
+        <w:t xml:space="preserve"> Caffeine, </w:t>
+      </w:r>
+      <w:proofErr w:type="spellStart"/>
+      <w:r>
+        <w:t>Ehcache</w:t>
+      </w:r>
+      <w:proofErr w:type="spellEnd"/>
+    </w:p>
+    <w:p>
+      <w:r>
+        <w:pict w14:anchorId="61836FB8">
+          <v:rect id="_x0000_i1076" style="width:0;height:1.5pt" o:hralign="center" o:hrstd="t" o:hr="t" fillcolor="#a0a0a0" stroked="f"/>
+        </w:pict>
+      </w:r>
+    </w:p>
+    <w:p>
+      <w:pPr>
+        <w:rPr>
+          <w:b/>
+          <w:bCs/>
+        </w:rPr>
+      </w:pPr>
+      <w:r>
+        <w:rPr>
+          <w:b/>
+          <w:bCs/>
+        </w:rPr>
+        <w:t>2. Distributed Cache</w:t>
+      </w:r>
+    </w:p>
+    <w:p>
+      <w:r>
+        <w:t>Stores data in a separate cache server that can be shared by multiple applications.</w:t>
+      </w:r>
+    </w:p>
+    <w:p>
+      <w:pPr>
+        <w:numPr>
+          <w:ilvl w:val="0"/>
+          <w:numId w:val="6"/>
+        </w:numPr>
+      </w:pPr>
+      <w:r>
+        <w:t xml:space="preserve">Useful for large applications and microservices. </w:t>
+      </w:r>
+    </w:p>
+    <w:p>
+      <w:pPr>
+        <w:numPr>
+          <w:ilvl w:val="0"/>
+          <w:numId w:val="6"/>
+        </w:numPr>
+      </w:pPr>
+      <w:r>
+        <w:t xml:space="preserve">Keeps data available across different servers. </w:t>
+      </w:r>
+    </w:p>
+    <w:p>
+      <w:r>
+        <w:rPr>
+          <w:b/>
+          <w:bCs/>
+        </w:rPr>
+        <w:t>Example:</w:t>
+      </w:r>
+      <w:r>
+        <w:t xml:space="preserve"> Redis</w:t>
+      </w:r>
+    </w:p>
+    <w:p>
+      <w:r>
+        <w:pict w14:anchorId="0A61CB9A">
+          <v:rect id="_x0000_i1077" style="width:0;height:1.5pt" o:hralign="center" o:hrstd="t" o:hr="t" fillcolor="#a0a0a0" stroked="f"/>
+        </w:pict>
+      </w:r>
+    </w:p>
+    <w:p>
+      <w:pPr>
+        <w:rPr>
+          <w:b/>
+          <w:bCs/>
+        </w:rPr>
+      </w:pPr>
+      <w:r>
+        <w:rPr>
+          <w:b/>
+          <w:bCs/>
+        </w:rPr>
+        <w:t>3. Disk Cache</w:t>
+      </w:r>
+    </w:p>
+    <w:p>
+      <w:r>
+        <w:t>Stores cached data on the computer's hard disk.</w:t>
+      </w:r>
+    </w:p>
+    <w:p>
+      <w:pPr>
+        <w:numPr>
+          <w:ilvl w:val="0"/>
+          <w:numId w:val="7"/>
+        </w:numPr>
+      </w:pPr>
+      <w:r>
+        <w:t xml:space="preserve">Slower than memory cache. </w:t>
+      </w:r>
+    </w:p>
+    <w:p>
+      <w:pPr>
+        <w:numPr>
+          <w:ilvl w:val="0"/>
+          <w:numId w:val="7"/>
+        </w:numPr>
+      </w:pPr>
+      <w:r>
+        <w:t xml:space="preserve">Data remains even after restarting the application. </w:t>
+      </w:r>
+    </w:p>
+    <w:p>
+      <w:r>
+        <w:pict w14:anchorId="64CC79AE">
+          <v:rect id="_x0000_i1078" style="width:0;height:1.5pt" o:hralign="center" o:hrstd="t" o:hr="t" fillcolor="#a0a0a0" stroked="f"/>
+        </w:pict>
+      </w:r>
+    </w:p>
+    <w:p>
+      <w:pPr>
+        <w:rPr>
+          <w:b/>
+          <w:bCs/>
+        </w:rPr>
+      </w:pPr>
+      <w:r>
+        <w:rPr>
+          <w:b/>
+          <w:bCs/>
+        </w:rPr>
+        <w:t>4. Database Cache</w:t>
+      </w:r>
+    </w:p>
+    <w:p>
+      <w:r>
+        <w:t>The database stores frequently used data in its own cache.</w:t>
+      </w:r>
+    </w:p>
+    <w:p>
+      <w:pPr>
+        <w:numPr>
+          <w:ilvl w:val="0"/>
+          <w:numId w:val="8"/>
+        </w:numPr>
+      </w:pPr>
+      <w:r>
+        <w:t xml:space="preserve">Improves database query performance. </w:t>
+      </w:r>
+    </w:p>
+    <w:p>
+      <w:pPr>
+        <w:numPr>
+          <w:ilvl w:val="0"/>
+          <w:numId w:val="8"/>
+        </w:numPr>
+      </w:pPr>
+      <w:r>
+        <w:t xml:space="preserve">Reduces repeated database access. </w:t>
+      </w:r>
+    </w:p>
+    <w:p>
+      <w:r>
+        <w:pict w14:anchorId="136504E5">
+          <v:rect id="_x0000_i1079" style="width:0;height:1.5pt" o:hralign="center" o:hrstd="t" o:hr="t" fillcolor="#a0a0a0" stroked="f"/>
+        </w:pict>
+      </w:r>
+    </w:p>
+    <w:p>
+      <w:pPr>
+        <w:rPr>
+          <w:b/>
+          <w:bCs/>
+        </w:rPr>
+      </w:pPr>
+      <w:r>
+        <w:rPr>
+          <w:b/>
+          <w:bCs/>
+        </w:rPr>
+        <w:t>5. Browser Cache</w:t>
+      </w:r>
+    </w:p>
+    <w:p>
+      <w:r>
+        <w:lastRenderedPageBreak/>
+        <w:t>Stores website resources such as images, CSS, and JavaScript in the user's browser.</w:t>
+      </w:r>
+    </w:p>
+    <w:p>
+      <w:pPr>
+        <w:numPr>
+          <w:ilvl w:val="0"/>
+          <w:numId w:val="9"/>
+        </w:numPr>
+      </w:pPr>
+      <w:r>
+        <w:t xml:space="preserve">Makes websites load faster on future visits. </w:t>
+      </w:r>
+    </w:p>
+    <w:p>
+      <w:r>
+        <w:pict w14:anchorId="25798243">
+          <v:rect id="_x0000_i1080" style="width:0;height:1.5pt" o:hralign="center" o:hrstd="t" o:hr="t" fillcolor="#a0a0a0" stroked="f"/>
+        </w:pict>
+      </w:r>
+    </w:p>
+    <w:p>
+      <w:pPr>
+        <w:rPr>
+          <w:b/>
+          <w:bCs/>
+        </w:rPr>
+      </w:pPr>
+      <w:r>
+        <w:rPr>
+          <w:b/>
+          <w:bCs/>
+        </w:rPr>
+        <w:t>6. CDN Cache</w:t>
+      </w:r>
+    </w:p>
+    <w:p>
+      <w:r>
+        <w:t>Stores website content on servers located in different regions of the world.</w:t>
+      </w:r>
+    </w:p>
+    <w:p>
+      <w:pPr>
+        <w:numPr>
+          <w:ilvl w:val="0"/>
+          <w:numId w:val="10"/>
+        </w:numPr>
+      </w:pPr>
+      <w:r>
+        <w:t xml:space="preserve">Helps users access websites faster from nearby servers. </w:t>
+      </w:r>
+    </w:p>
+    <w:p>
+      <w:r>
+        <w:rPr>
+          <w:b/>
+          <w:bCs/>
+        </w:rPr>
+        <w:t>Example:</w:t>
+      </w:r>
+      <w:r>
+        <w:t xml:space="preserve"> Cloudflare</w:t>
+      </w:r>
+    </w:p>
+    <w:p>
+      <w:r>
+        <w:pict w14:anchorId="4186F93D">
+          <v:rect id="_x0000_i1081" style="width:0;height:1.5pt" o:hralign="center" o:hrstd="t" o:hr="t" fillcolor="#a0a0a0" stroked="f"/>
+        </w:pict>
+      </w:r>
+    </w:p>
+    <w:p>
+      <w:pPr>
+        <w:rPr>
+          <w:b/>
+          <w:bCs/>
+        </w:rPr>
+      </w:pPr>
+      <w:r>
+        <w:rPr>
+          <w:b/>
+          <w:bCs/>
+        </w:rPr>
+        <w:t>Task 21: List the caching annotations with their usage.</w:t>
+      </w:r>
+    </w:p>
+    <w:tbl>
+      <w:tblPr>
+        <w:tblW w:w="0" w:type="auto"/>
+        <w:tblCellSpacing w:w="15" w:type="dxa"/>
+        <w:tblCellMar>
+          <w:top w:w="15" w:type="dxa"/>
+          <w:left w:w="15" w:type="dxa"/>
+          <w:bottom w:w="15" w:type="dxa"/>
+          <w:right w:w="15" w:type="dxa"/>
+        </w:tblCellMar>
+        <w:tblLook w:val="04A0" w:firstRow="1" w:lastRow="0" w:firstColumn="1" w:lastColumn="0" w:noHBand="0" w:noVBand="1"/>
+      </w:tblPr>
+      <w:tblGrid>
+        <w:gridCol w:w="1944"/>
+        <w:gridCol w:w="7082"/>
+      </w:tblGrid>
+      <w:tr>
+        <w:trPr>
+          <w:tblHeader/>
+          <w:tblCellSpacing w:w="15" w:type="dxa"/>
+        </w:trPr>
+        <w:tc>
+          <w:tcPr>
+            <w:tcW w:w="0" w:type="auto"/>
+            <w:vAlign w:val="center"/>
+            <w:hideMark/>
+          </w:tcPr>
+          <w:p>
+            <w:pPr>
+              <w:rPr>
+                <w:b/>
+                <w:bCs/>
+              </w:rPr>
+            </w:pPr>
+            <w:r>
+              <w:rPr>
+                <w:b/>
+                <w:bCs/>
+              </w:rPr>
+              <w:t>Annotation</w:t>
+            </w:r>
+          </w:p>
+        </w:tc>
+        <w:tc>
+          <w:tcPr>
+            <w:tcW w:w="0" w:type="auto"/>
+            <w:vAlign w:val="center"/>
+            <w:hideMark/>
+          </w:tcPr>
+          <w:p>
+            <w:pPr>
+              <w:rPr>
+                <w:b/>
+                <w:bCs/>
+              </w:rPr>
+            </w:pPr>
+            <w:r>
+              <w:rPr>
+                <w:b/>
+                <w:bCs/>
+              </w:rPr>
+              <w:t>Usage</w:t>
+            </w:r>
+          </w:p>
+        </w:tc>
+      </w:tr>
+      <w:tr>
+        <w:trPr>
+          <w:tblCellSpacing w:w="15" w:type="dxa"/>
+        </w:trPr>
+        <w:tc>
+          <w:tcPr>
+            <w:tcW w:w="0" w:type="auto"/>
+            <w:vAlign w:val="center"/>
+            <w:hideMark/>
+          </w:tcPr>
+          <w:p>
+            <w:r>
+              <w:rPr>
+                <w:b/>
+                <w:bCs/>
+              </w:rPr>
+              <w:t>@EnableCaching</w:t>
+            </w:r>
+          </w:p>
+        </w:tc>
+        <w:tc>
+          <w:tcPr>
+            <w:tcW w:w="0" w:type="auto"/>
+            <w:vAlign w:val="center"/>
+            <w:hideMark/>
+          </w:tcPr>
+          <w:p>
+            <w:r>
+              <w:t>Enables caching in a Spring Boot application.</w:t>
+            </w:r>
+          </w:p>
+        </w:tc>
+      </w:tr>
+      <w:tr>
+        <w:trPr>
+          <w:tblCellSpacing w:w="15" w:type="dxa"/>
+        </w:trPr>
+        <w:tc>
+          <w:tcPr>
+            <w:tcW w:w="0" w:type="auto"/>
+            <w:vAlign w:val="center"/>
+            <w:hideMark/>
+          </w:tcPr>
+          <w:p>
+            <w:r>
+              <w:rPr>
+                <w:b/>
+                <w:bCs/>
+              </w:rPr>
+              <w:t>@Cacheable</w:t>
+            </w:r>
+          </w:p>
+        </w:tc>
+        <w:tc>
+          <w:tcPr>
+            <w:tcW w:w="0" w:type="auto"/>
+            <w:vAlign w:val="center"/>
+            <w:hideMark/>
+          </w:tcPr>
+          <w:p>
+            <w:r>
+              <w:t>Stores the result of a method in the cache. If the same method is called again with the same input, the cached result is returned.</w:t>
+            </w:r>
+          </w:p>
+        </w:tc>
+      </w:tr>
+      <w:tr>
+        <w:trPr>
+          <w:tblCellSpacing w:w="15" w:type="dxa"/>
+        </w:trPr>
+        <w:tc>
+          <w:tcPr>
+            <w:tcW w:w="0" w:type="auto"/>
+            <w:vAlign w:val="center"/>
+            <w:hideMark/>
+          </w:tcPr>
+          <w:p>
+            <w:r>
+              <w:rPr>
+                <w:b/>
+                <w:bCs/>
+              </w:rPr>
+              <w:t>@CachePut</w:t>
+            </w:r>
+          </w:p>
+        </w:tc>
+        <w:tc>
+          <w:tcPr>
+            <w:tcW w:w="0" w:type="auto"/>
+            <w:vAlign w:val="center"/>
+            <w:hideMark/>
+          </w:tcPr>
+          <w:p>
+            <w:r>
+              <w:t>Updates the cache with the latest data every time the method is executed.</w:t>
+            </w:r>
+          </w:p>
+        </w:tc>
+      </w:tr>
+      <w:tr>
+        <w:trPr>
+          <w:tblCellSpacing w:w="15" w:type="dxa"/>
+        </w:trPr>
+        <w:tc>
+          <w:tcPr>
+            <w:tcW w:w="0" w:type="auto"/>
+            <w:vAlign w:val="center"/>
+            <w:hideMark/>
+          </w:tcPr>
+          <w:p>
+            <w:r>
+              <w:rPr>
+                <w:b/>
+                <w:bCs/>
+              </w:rPr>
+              <w:t>@CacheEvict</w:t>
+            </w:r>
+          </w:p>
+        </w:tc>
+        <w:tc>
+          <w:tcPr>
+            <w:tcW w:w="0" w:type="auto"/>
+            <w:vAlign w:val="center"/>
+            <w:hideMark/>
+          </w:tcPr>
+          <w:p>
+            <w:r>
+              <w:t>Removes data from the cache. Usually used after updating or deleting records.</w:t>
+            </w:r>
+          </w:p>
+        </w:tc>
+      </w:tr>
+      <w:tr>
+        <w:trPr>
+          <w:tblCellSpacing w:w="15" w:type="dxa"/>
+        </w:trPr>
+        <w:tc>
+          <w:tcPr>
+            <w:tcW w:w="0" w:type="auto"/>
+            <w:vAlign w:val="center"/>
+            <w:hideMark/>
+          </w:tcPr>
+          <w:p>
+            <w:r>
+              <w:rPr>
+                <w:b/>
+                <w:bCs/>
+              </w:rPr>
+              <w:t>@Caching</w:t>
+            </w:r>
+          </w:p>
+        </w:tc>
+        <w:tc>
+          <w:tcPr>
+            <w:tcW w:w="0" w:type="auto"/>
+            <w:vAlign w:val="center"/>
+            <w:hideMark/>
+          </w:tcPr>
+          <w:p>
+            <w:r>
+              <w:t>Allows multiple caching annotations to be used on the same method.</w:t>
+            </w:r>
+          </w:p>
+        </w:tc>
+      </w:tr>
+      <w:tr>
+        <w:trPr>
+          <w:tblCellSpacing w:w="15" w:type="dxa"/>
+        </w:trPr>
+        <w:tc>
+          <w:tcPr>
+            <w:tcW w:w="0" w:type="auto"/>
+            <w:vAlign w:val="center"/>
+            <w:hideMark/>
+          </w:tcPr>
+          <w:p>
+            <w:r>
+              <w:rPr>
+                <w:b/>
+                <w:bCs/>
+              </w:rPr>
+              <w:t>@CacheConfig</w:t>
+            </w:r>
+          </w:p>
+        </w:tc>
+        <w:tc>
+          <w:tcPr>
+            <w:tcW w:w="0" w:type="auto"/>
+            <w:vAlign w:val="center"/>
+            <w:hideMark/>
+          </w:tcPr>
+          <w:p>
+            <w:r>
+              <w:t>Defines common cache settings for a class, so they don't have to be repeated.</w:t>
+            </w:r>
+          </w:p>
+        </w:tc>
+      </w:tr>
+    </w:tbl>
+    <w:p/>
+    <w:p>
+      <w:pPr>
+        <w:rPr>
+          <w:b/>
+          <w:bCs/>
+        </w:rPr>
+      </w:pPr>
+      <w:r>
+        <w:rPr>
+          <w:b/>
+          <w:bCs/>
+        </w:rPr>
+        <w:t>Task 22:</w:t>
+      </w:r>
+    </w:p>
+    <w:p>
+      <w:pPr>
+        <w:rPr>
+          <w:b/>
+          <w:bCs/>
+        </w:rPr>
+      </w:pPr>
+      <w:r>
+        <w:rPr>
+          <w:b/>
+          <w:bCs/>
+        </w:rPr>
+        <w:t>What do you think is @InjectMocks annotation does?</w:t>
+      </w:r>
+    </w:p>
+    <w:p>
+      <w:pPr>
+        <w:numPr>
+          <w:ilvl w:val="0"/>
+          <w:numId w:val="12"/>
+        </w:numPr>
+      </w:pPr>
+      <w:r>
+        <w:t>@InjectMocks tells Mockito to create an instance of the class being tested and automatically inject the required mock dependencies into it.</w:t>
+      </w:r>
+    </w:p>
+    <w:p>
+      <w:pPr>
+        <w:numPr>
+          <w:ilvl w:val="0"/>
+          <w:numId w:val="12"/>
+        </w:numPr>
+      </w:pPr>
+      <w:r>
+        <w:t>@Mock creates fake dependencies, and @InjectMocks puts those fake dependencies into the class under test.</w:t>
+      </w:r>
+    </w:p>
+    <w:p>
+      <w:pPr>
+        <w:numPr>
+          <w:ilvl w:val="0"/>
+          <w:numId w:val="12"/>
+        </w:numPr>
+      </w:pPr>
+    </w:p>
+    <w:p>
+      <w:pPr>
+        <w:rPr>
+          <w:b/>
+          <w:bCs/>
+        </w:rPr>
+      </w:pPr>
+      <w:r>
+        <w:rPr>
+          <w:b/>
+          <w:bCs/>
+        </w:rPr>
+        <w:lastRenderedPageBreak/>
+        <w:t>Task 23:</w:t>
+      </w:r>
+    </w:p>
+    <w:p>
+      <w:pPr>
+        <w:rPr>
+          <w:b/>
+          <w:bCs/>
+        </w:rPr>
+      </w:pPr>
+      <w:r>
+        <w:rPr>
+          <w:b/>
+          <w:bCs/>
+        </w:rPr>
+        <w:t>Write about @spy annotation and explain the functionality in a small piece of code</w:t>
+      </w:r>
+    </w:p>
+    <w:p>
+      <w:r>
+        <w:t xml:space="preserve">@Spy is used when you want to create a </w:t>
+      </w:r>
+      <w:r>
+        <w:rPr>
+          <w:b/>
+          <w:bCs/>
+        </w:rPr>
+        <w:t>partial mock</w:t>
+      </w:r>
+      <w:r>
+        <w:t xml:space="preserve"> of a real object. Unlike @Mock, which creates a completely fake object, @Spy keeps the actual </w:t>
+      </w:r>
+      <w:proofErr w:type="spellStart"/>
+      <w:r>
+        <w:t>behavior</w:t>
+      </w:r>
+      <w:proofErr w:type="spellEnd"/>
+      <w:r>
+        <w:t xml:space="preserve"> of the object but allows you to stub or verify specific methods.</w:t>
+      </w:r>
+    </w:p>
+    <w:p>
+      <w:r>
+        <w:t>import </w:t>
+      </w:r>
+      <w:proofErr w:type="spellStart"/>
+      <w:proofErr w:type="gramStart"/>
+      <w:r>
+        <w:t>org.junit.jupiter.api.Test</w:t>
+      </w:r>
+      <w:proofErr w:type="spellEnd"/>
+      <w:proofErr w:type="gramEnd"/>
+      <w:r>
+        <w:t>;</w:t>
+      </w:r>
+      <w:r>
+        <w:br/>
+        <w:t>import </w:t>
+      </w:r>
+      <w:proofErr w:type="spellStart"/>
+      <w:proofErr w:type="gramStart"/>
+      <w:r>
+        <w:t>org.mockito</w:t>
+      </w:r>
+      <w:proofErr w:type="gramEnd"/>
+      <w:r>
+        <w:t>.Spy</w:t>
+      </w:r>
+      <w:proofErr w:type="spellEnd"/>
+      <w:r>
+        <w:t>;</w:t>
+      </w:r>
+      <w:r>
+        <w:br/>
+        <w:t>import </w:t>
+      </w:r>
+      <w:proofErr w:type="spellStart"/>
+      <w:proofErr w:type="gramStart"/>
+      <w:r>
+        <w:t>java.util</w:t>
+      </w:r>
+      <w:proofErr w:type="gramEnd"/>
+      <w:r>
+        <w:t>.ArrayList</w:t>
+      </w:r>
+      <w:proofErr w:type="spellEnd"/>
+      <w:r>
+        <w:t>;</w:t>
+      </w:r>
+      <w:r>
+        <w:br/>
+        <w:t>import </w:t>
+      </w:r>
+      <w:proofErr w:type="spellStart"/>
+      <w:proofErr w:type="gramStart"/>
+      <w:r>
+        <w:t>java.util</w:t>
+      </w:r>
+      <w:proofErr w:type="gramEnd"/>
+      <w:r>
+        <w:t>.List</w:t>
+      </w:r>
+      <w:proofErr w:type="spellEnd"/>
+      <w:r>
+        <w:t>;</w:t>
+      </w:r>
+      <w:r>
+        <w:br/>
+        <w:t>import static </w:t>
+      </w:r>
+      <w:proofErr w:type="spellStart"/>
+      <w:proofErr w:type="gramStart"/>
+      <w:r>
+        <w:t>org.mockito</w:t>
+      </w:r>
+      <w:proofErr w:type="gramEnd"/>
+      <w:r>
+        <w:t>.Mockito</w:t>
+      </w:r>
+      <w:proofErr w:type="spellEnd"/>
+      <w:r>
+        <w:t>.*;</w:t>
+      </w:r>
+      <w:r>
+        <w:br/>
+      </w:r>
+    </w:p>
+    <w:p>
+      <w:r>
+        <w:t>class </w:t>
+      </w:r>
+      <w:proofErr w:type="spellStart"/>
+      <w:r>
+        <w:t>SpyExampleTest</w:t>
+      </w:r>
+      <w:proofErr w:type="spellEnd"/>
+      <w:r>
+        <w:t xml:space="preserve"> {</w:t>
+      </w:r>
+      <w:r>
+        <w:br/>
+        <w:t>    @Spy</w:t>
+      </w:r>
+      <w:r>
+        <w:br/>
+        <w:t>    List&lt;String&gt; list = new </w:t>
+      </w:r>
+      <w:proofErr w:type="spellStart"/>
+      <w:r>
+        <w:t>ArrayList</w:t>
+      </w:r>
+      <w:proofErr w:type="spellEnd"/>
+      <w:r>
+        <w:t>&lt;</w:t>
+      </w:r>
+      <w:proofErr w:type="gramStart"/>
+      <w:r>
+        <w:t>&gt;(</w:t>
+      </w:r>
+      <w:proofErr w:type="gramEnd"/>
+      <w:r>
+        <w:t>);</w:t>
+      </w:r>
+      <w:r>
+        <w:br/>
+      </w:r>
+      <w:r>
+        <w:br/>
+        <w:t>    @Test</w:t>
+      </w:r>
+      <w:r>
+        <w:br/>
+        <w:t>    void </w:t>
+      </w:r>
+      <w:proofErr w:type="spellStart"/>
+      <w:proofErr w:type="gramStart"/>
+      <w:r>
+        <w:t>testSpy</w:t>
+      </w:r>
+      <w:proofErr w:type="spellEnd"/>
+      <w:r>
+        <w:t>(</w:t>
+      </w:r>
+      <w:proofErr w:type="gramEnd"/>
+      <w:r>
+        <w:t>) {</w:t>
+      </w:r>
+      <w:r>
+        <w:br/>
+        <w:t xml:space="preserve">        </w:t>
+      </w:r>
+      <w:proofErr w:type="spellStart"/>
+      <w:r>
+        <w:t>list.add</w:t>
+      </w:r>
+      <w:proofErr w:type="spellEnd"/>
+      <w:r>
+        <w:t>("Apple");</w:t>
+      </w:r>
+      <w:r>
+        <w:br/>
+        <w:t xml:space="preserve">        </w:t>
+      </w:r>
+      <w:proofErr w:type="spellStart"/>
+      <w:r>
+        <w:t>list.add</w:t>
+      </w:r>
+      <w:proofErr w:type="spellEnd"/>
+      <w:r>
+        <w:t>("Banana");</w:t>
+      </w:r>
+      <w:r>
+        <w:br/>
+        <w:t>        verify(list</w:t>
+      </w:r>
+      <w:proofErr w:type="gramStart"/>
+      <w:r>
+        <w:t>).add</w:t>
+      </w:r>
+      <w:proofErr w:type="gramEnd"/>
+      <w:r>
+        <w:t>("Apple");</w:t>
+      </w:r>
+      <w:r>
+        <w:br/>
+        <w:t xml:space="preserve">        </w:t>
+      </w:r>
+      <w:proofErr w:type="spellStart"/>
+      <w:r>
+        <w:t>System.out.println</w:t>
+      </w:r>
+      <w:proofErr w:type="spellEnd"/>
+      <w:r>
+        <w:t>(</w:t>
+      </w:r>
+      <w:proofErr w:type="spellStart"/>
+      <w:proofErr w:type="gramStart"/>
+      <w:r>
+        <w:t>list.size</w:t>
+      </w:r>
+      <w:proofErr w:type="spellEnd"/>
+      <w:proofErr w:type="gramEnd"/>
+      <w:r>
+        <w:t>()); // Output: 2</w:t>
+      </w:r>
+      <w:r>
+        <w:br/>
+        <w:t xml:space="preserve">  </w:t>
+      </w:r>
+      <w:proofErr w:type="gramStart"/>
+      <w:r>
+        <w:t>  }</w:t>
+      </w:r>
+      <w:proofErr w:type="gramEnd"/>
+      <w:r>
+        <w:br/>
+        <w:t>}</w:t>
+      </w:r>
+    </w:p>
+    <w:p>
+      <w:pPr>
+        <w:rPr>
+          <w:b/>
+          <w:bCs/>
+        </w:rPr>
+      </w:pPr>
+      <w:r>
+        <w:rPr>
+          <w:b/>
+          <w:bCs/>
+        </w:rPr>
+        <w:t>Task 24:</w:t>
+      </w:r>
+    </w:p>
+    <w:p>
+      <w:pPr>
+        <w:rPr>
+          <w:b/>
+          <w:bCs/>
+        </w:rPr>
+      </w:pPr>
+      <w:r>
+        <w:rPr>
+          <w:b/>
+          <w:bCs/>
+        </w:rPr>
+        <w:t>Why is @Mock annotation used?</w:t>
+      </w:r>
+    </w:p>
+    <w:p>
+      <w:pPr>
+        <w:numPr>
+          <w:ilvl w:val="0"/>
+          <w:numId w:val="13"/>
+        </w:numPr>
+      </w:pPr>
+      <w:r>
+        <w:t xml:space="preserve">@Mock is used to create a </w:t>
+      </w:r>
+      <w:r>
+        <w:rPr>
+          <w:b/>
+          <w:bCs/>
+        </w:rPr>
+        <w:t>fake object</w:t>
+      </w:r>
+      <w:r>
+        <w:t xml:space="preserve"> of a class or interface during testing. It helps isolate the class under test by replacing real dependencies with controlled, simulated </w:t>
+      </w:r>
+      <w:proofErr w:type="spellStart"/>
+      <w:r>
+        <w:t>behavior</w:t>
+      </w:r>
+      <w:proofErr w:type="spellEnd"/>
+      <w:r>
+        <w:t>.</w:t>
+      </w:r>
+    </w:p>
+    <w:p>
+      <w:pPr>
+        <w:numPr>
+          <w:ilvl w:val="0"/>
+          <w:numId w:val="13"/>
+        </w:numPr>
+      </w:pPr>
+    </w:p>
+    <w:p>
+      <w:pPr>
+        <w:rPr>
+          <w:b/>
+          <w:bCs/>
+        </w:rPr>
+      </w:pPr>
+      <w:r>
+        <w:rPr>
+          <w:b/>
+          <w:bCs/>
+        </w:rPr>
+        <w:t>Task 25:</w:t>
+      </w:r>
+    </w:p>
+    <w:p>
+      <w:pPr>
+        <w:rPr>
+          <w:b/>
+          <w:bCs/>
+        </w:rPr>
+      </w:pPr>
+      <w:r>
+        <w:rPr>
+          <w:b/>
+          <w:bCs/>
+        </w:rPr>
+        <w:t>What is Partial mocking? Which annotation is used for partial mocking?</w:t>
+      </w:r>
+    </w:p>
+    <w:p>
+      <w:r>
+        <w:rPr>
+          <w:b/>
+          <w:bCs/>
+        </w:rPr>
+        <w:t>Partial Mocking</w:t>
+      </w:r>
+      <w:r>
+        <w:t xml:space="preserve"> means using a real object while mocking only specific methods of that object. The actual methods run by default, but you can override selected methods when needed.</w:t>
+      </w:r>
+    </w:p>
+    <w:p>
+      <w:pPr>
+        <w:numPr>
+          <w:ilvl w:val="0"/>
+          <w:numId w:val="14"/>
+        </w:numPr>
+      </w:pPr>
+      <w:r>
+        <w:t>@Spy</w:t>
+      </w:r>
+    </w:p>
+    <w:p>
+      <w:pPr>
+        <w:rPr>
+          <w:b/>
+          <w:bCs/>
+        </w:rPr>
+      </w:pPr>
+      <w:r>
+        <w:rPr>
+          <w:b/>
+          <w:bCs/>
+        </w:rPr>
+        <w:lastRenderedPageBreak/>
+        <w:t>Task 26:</w:t>
+      </w:r>
+    </w:p>
+    <w:p>
+      <w:pPr>
+        <w:rPr>
+          <w:b/>
+          <w:bCs/>
+        </w:rPr>
+      </w:pPr>
+      <w:r>
+        <w:rPr>
+          <w:b/>
+          <w:bCs/>
+        </w:rPr>
+        <w:t>For the code given what is @verify annotation used for and why do we use it?</w:t>
+      </w:r>
+    </w:p>
+    <w:p>
+      <w:pPr>
+        <w:numPr>
+          <w:ilvl w:val="0"/>
+          <w:numId w:val="15"/>
+        </w:numPr>
+      </w:pPr>
+      <w:r>
+        <w:t>@verify is a Mockito Method used to check whether a particular method on a mock object was called during the test.</w:t>
+      </w:r>
+    </w:p>
+    <w:p>
+      <w:pPr>
+        <w:numPr>
+          <w:ilvl w:val="0"/>
+          <w:numId w:val="15"/>
+        </w:numPr>
+      </w:pPr>
+      <w:r>
+        <w:rPr>
+          <w:b/>
+          <w:bCs/>
+        </w:rPr>
+        <w:t>verify(</w:t>
+      </w:r>
+      <w:proofErr w:type="spellStart"/>
+      <w:r>
+        <w:rPr>
+          <w:b/>
+          <w:bCs/>
+        </w:rPr>
+        <w:t>mockRepo</w:t>
+      </w:r>
+      <w:proofErr w:type="spellEnd"/>
+      <w:proofErr w:type="gramStart"/>
+      <w:r>
+        <w:rPr>
+          <w:b/>
+          <w:bCs/>
+        </w:rPr>
+        <w:t>).save</w:t>
+      </w:r>
+      <w:proofErr w:type="gramEnd"/>
+      <w:r>
+        <w:rPr>
+          <w:b/>
+          <w:bCs/>
+        </w:rPr>
+        <w:t>(account</w:t>
+      </w:r>
+      <w:proofErr w:type="gramStart"/>
+      <w:r>
+        <w:rPr>
+          <w:b/>
+          <w:bCs/>
+        </w:rPr>
+        <w:t>);</w:t>
+      </w:r>
+      <w:r>
+        <w:t>  -</w:t>
+      </w:r>
+      <w:proofErr w:type="gramEnd"/>
+      <w:r>
+        <w:t xml:space="preserve">verifies that the </w:t>
+      </w:r>
+      <w:proofErr w:type="gramStart"/>
+      <w:r>
+        <w:t>save(</w:t>
+      </w:r>
+      <w:proofErr w:type="gramEnd"/>
+      <w:r>
+        <w:t xml:space="preserve">) method was called on </w:t>
+      </w:r>
+      <w:proofErr w:type="spellStart"/>
+      <w:r>
+        <w:t>mockRepo</w:t>
+      </w:r>
+      <w:proofErr w:type="spellEnd"/>
+    </w:p>
+    <w:p>
+      <w:pPr>
+        <w:numPr>
+          <w:ilvl w:val="0"/>
+          <w:numId w:val="15"/>
+        </w:numPr>
+      </w:pPr>
+      <w:proofErr w:type="gramStart"/>
+      <w:r>
+        <w:rPr>
+          <w:b/>
+          <w:bCs/>
+        </w:rPr>
+        <w:t>verify(</w:t>
+      </w:r>
+      <w:proofErr w:type="spellStart"/>
+      <w:proofErr w:type="gramEnd"/>
+      <w:r>
+        <w:rPr>
+          <w:b/>
+          <w:bCs/>
+        </w:rPr>
+        <w:t>mockRepo</w:t>
+      </w:r>
+      <w:proofErr w:type="spellEnd"/>
+      <w:r>
+        <w:rPr>
+          <w:b/>
+          <w:bCs/>
+        </w:rPr>
+        <w:t>, never()</w:t>
+      </w:r>
+      <w:proofErr w:type="gramStart"/>
+      <w:r>
+        <w:rPr>
+          <w:b/>
+          <w:bCs/>
+        </w:rPr>
+        <w:t>).save</w:t>
+      </w:r>
+      <w:proofErr w:type="gramEnd"/>
+      <w:r>
+        <w:rPr>
+          <w:b/>
+          <w:bCs/>
+        </w:rPr>
+        <w:t>(account);</w:t>
+      </w:r>
+      <w:r>
+        <w:t xml:space="preserve"> - verifies that the </w:t>
+      </w:r>
+      <w:proofErr w:type="gramStart"/>
+      <w:r>
+        <w:t>save(</w:t>
+      </w:r>
+      <w:proofErr w:type="gramEnd"/>
+      <w:r>
+        <w:t xml:space="preserve">) method was </w:t>
+      </w:r>
+      <w:proofErr w:type="gramStart"/>
+      <w:r>
+        <w:t>not  called</w:t>
+      </w:r>
+      <w:proofErr w:type="gramEnd"/>
+      <w:r>
+        <w:t>.</w:t>
+      </w:r>
+    </w:p>
+    <w:p>
+      <w:r>
+        <w:t> </w:t>
+      </w:r>
+    </w:p>
+    <w:p>
+      <w:r>
+        <w:t> </w:t>
+      </w:r>
+    </w:p>
+    <w:p>
+      <w:pPr>
+        <w:rPr>
+          <w:b/>
+          <w:bCs/>
+        </w:rPr>
+      </w:pPr>
+      <w:r>
+        <w:rPr>
+          <w:b/>
+          <w:bCs/>
+        </w:rPr>
+        <w:t>Task 27:</w:t>
+      </w:r>
+    </w:p>
+    <w:p>
+      <w:pPr>
+        <w:rPr>
+          <w:b/>
+          <w:bCs/>
+        </w:rPr>
+      </w:pPr>
+      <w:r>
+        <w:rPr>
+          <w:b/>
+          <w:bCs/>
+        </w:rPr>
+        <w:t xml:space="preserve">List down few more annotations that we use for </w:t>
+      </w:r>
+      <w:proofErr w:type="gramStart"/>
+      <w:r>
+        <w:rPr>
+          <w:b/>
+          <w:bCs/>
+        </w:rPr>
+        <w:t>mocking .</w:t>
+      </w:r>
+      <w:proofErr w:type="gramEnd"/>
+    </w:p>
+    <w:p>
+      <w:pPr>
+        <w:numPr>
+          <w:ilvl w:val="0"/>
+          <w:numId w:val="16"/>
+        </w:numPr>
+      </w:pPr>
+      <w:r>
+        <w:rPr>
+          <w:b/>
+          <w:bCs/>
+        </w:rPr>
+        <w:t>@Mock</w:t>
+      </w:r>
+      <w:r>
+        <w:t xml:space="preserve"> – Creates a fake/mock object of a class or interface.</w:t>
+      </w:r>
+    </w:p>
+    <w:p>
+      <w:pPr>
+        <w:numPr>
+          <w:ilvl w:val="0"/>
+          <w:numId w:val="16"/>
+        </w:numPr>
+      </w:pPr>
+      <w:r>
+        <w:rPr>
+          <w:b/>
+          <w:bCs/>
+        </w:rPr>
+        <w:t>@InjectMocks</w:t>
+      </w:r>
+      <w:r>
+        <w:t xml:space="preserve"> – Creates the object under test and injects mock dependencies into it.</w:t>
+      </w:r>
+    </w:p>
+    <w:p>
+      <w:pPr>
+        <w:numPr>
+          <w:ilvl w:val="0"/>
+          <w:numId w:val="16"/>
+        </w:numPr>
+      </w:pPr>
+      <w:r>
+        <w:rPr>
+          <w:b/>
+          <w:bCs/>
+        </w:rPr>
+        <w:t>@Spy</w:t>
+      </w:r>
+      <w:r>
+        <w:t xml:space="preserve"> – Creates a partial mock that uses real methods unless stubbed.</w:t>
+      </w:r>
+    </w:p>
+    <w:p>
+      <w:pPr>
+        <w:numPr>
+          <w:ilvl w:val="0"/>
+          <w:numId w:val="16"/>
+        </w:numPr>
+      </w:pPr>
+      <w:r>
+        <w:rPr>
+          <w:b/>
+          <w:bCs/>
+        </w:rPr>
+        <w:t>@Captor</w:t>
+      </w:r>
+      <w:r>
+        <w:t xml:space="preserve"> – Captures method arguments passed to mock objects for verification.</w:t>
+      </w:r>
+    </w:p>
+    <w:p>
+      <w:pPr>
+        <w:numPr>
+          <w:ilvl w:val="0"/>
+          <w:numId w:val="16"/>
+        </w:numPr>
+      </w:pPr>
+      <w:r>
+        <w:rPr>
+          <w:b/>
+          <w:bCs/>
+        </w:rPr>
+        <w:t>@</w:t>
+      </w:r>
+      <w:proofErr w:type="gramStart"/>
+      <w:r>
+        <w:rPr>
+          <w:b/>
+          <w:bCs/>
+        </w:rPr>
+        <w:t>ExtendWith(</w:t>
+      </w:r>
+      <w:proofErr w:type="gramEnd"/>
+      <w:r>
+        <w:rPr>
+          <w:b/>
+          <w:bCs/>
+        </w:rPr>
+        <w:t>MockitoExtension.class)</w:t>
+      </w:r>
+      <w:r>
+        <w:t xml:space="preserve"> – Enables Mockito annotations in JUnit 5 tests.</w:t>
+      </w:r>
+    </w:p>
+    <w:p>
+      <w:pPr>
+        <w:numPr>
+          <w:ilvl w:val="0"/>
+          <w:numId w:val="16"/>
+        </w:numPr>
+      </w:pPr>
+      <w:r>
+        <w:rPr>
+          <w:b/>
+          <w:bCs/>
+        </w:rPr>
+        <w:t>@MockBean</w:t>
+      </w:r>
+      <w:r>
+        <w:t xml:space="preserve"> </w:t>
+      </w:r>
+      <w:r>
+        <w:rPr>
+          <w:i/>
+          <w:iCs/>
+        </w:rPr>
+        <w:t>(Spring Boot)</w:t>
+      </w:r>
+      <w:r>
+        <w:t xml:space="preserve"> – Replaces a Spring bean with a mock in the application context.</w:t>
+      </w:r>
+    </w:p>
+    <w:p>
+      <w:pPr>
+        <w:numPr>
+          <w:ilvl w:val="0"/>
+          <w:numId w:val="16"/>
+        </w:numPr>
+      </w:pPr>
+      <w:r>
+        <w:rPr>
+          <w:b/>
+          <w:bCs/>
+        </w:rPr>
+        <w:t>@SpyBean</w:t>
+      </w:r>
+      <w:r>
+        <w:t xml:space="preserve"> </w:t>
+      </w:r>
+      <w:r>
+        <w:rPr>
+          <w:i/>
+          <w:iCs/>
+        </w:rPr>
+        <w:t>(Spring Boot)</w:t>
+      </w:r>
+      <w:r>
+        <w:t xml:space="preserve"> – Wraps an existing Spring bean with a Mockito spy.</w:t>
+      </w:r>
+    </w:p>
+    <w:p>
+      <w:r>
+        <w:t> </w:t>
+      </w:r>
+    </w:p>
+    <w:p>
+      <w:r>
+        <w:t> </w:t>
+      </w:r>
+    </w:p>
     <w:sectPr>
       <w:pgSz w:w="11906" w:h="16838"/>
       <w:pgMar w:top="1440" w:right="1440" w:bottom="1440" w:left="1440" w:header="708" w:footer="708" w:gutter="0"/>
@@ -2479,6 +4890,2307 @@
     </w:sectPr>
   </w:body>
 </w:document>
+</file>
+
+<file path=word/numbering.xml><?xml version="1.0" encoding="utf-8"?>
+<w:numbering xmlns:wpc="http://schemas.microsoft.com/office/word/2010/wordprocessingCanvas" xmlns:cx="http://schemas.microsoft.com/office/drawing/2014/chartex" xmlns:cx1="http://schemas.microsoft.com/office/drawing/2015/9/8/chartex" xmlns:cx2="http://schemas.microsoft.com/office/drawing/2015/10/21/chartex" xmlns:cx3="http://schemas.microsoft.com/office/drawing/2016/5/9/chartex" xmlns:cx4="http://schemas.microsoft.com/office/drawing/2016/5/10/chartex" xmlns:cx5="http://schemas.microsoft.com/office/drawing/2016/5/11/chartex" xmlns:cx6="http://schemas.microsoft.com/office/drawing/2016/5/12/chartex" xmlns:cx7="http://schemas.microsoft.com/office/drawing/2016/5/13/chartex" xmlns:cx8="http://schemas.microsoft.com/office/drawing/2016/5/14/chartex" xmlns:mc="http://schemas.openxmlformats.org/markup-compatibility/2006" xmlns:aink="http://schemas.microsoft.com/office/drawing/2016/ink" xmlns:am3d="http://schemas.microsoft.com/office/drawing/2017/model3d" xmlns:o="urn:schemas-microsoft-com:office:office" xmlns:oel="http://schemas.microsoft.com/office/2019/extlst" xmlns:r="http://schemas.openxmlformats.org/officeDocument/2006/relationships" xmlns:m="http://schemas.openxmlformats.org/officeDocument/2006/math" xmlns:v="urn:schemas-microsoft-com:vml" xmlns:wp14="http://schemas.microsoft.com/office/word/2010/wordprocessingDrawing" xmlns:wp="http://schemas.openxmlformats.org/drawingml/2006/wordprocessingDrawing" xmlns:w10="urn:schemas-microsoft-com:office:word" xmlns:w="http://schemas.openxmlformats.org/wordprocessingml/2006/main" xmlns:w14="http://schemas.microsoft.com/office/word/2010/wordml" xmlns:w15="http://schemas.microsoft.com/office/word/2012/wordml" xmlns:w16cex="http://schemas.microsoft.com/office/word/2018/wordml/cex" xmlns:w16cid="http://schemas.microsoft.com/office/word/2016/wordml/cid" xmlns:w16="http://schemas.microsoft.com/office/word/2018/wordml" xmlns:w16du="http://schemas.microsoft.com/office/word/2023/wordml/word16du" xmlns:w16sdtdh="http://schemas.microsoft.com/office/word/2020/wordml/sdtdatahash" xmlns:w16sdtfl="http://schemas.microsoft.com/office/word/2024/wordml/sdtformatlock" xmlns:w16se="http://schemas.microsoft.com/office/word/2015/wordml/symex" xmlns:wpg="http://schemas.microsoft.com/office/word/2010/wordprocessingGroup" xmlns:wpi="http://schemas.microsoft.com/office/word/2010/wordprocessingInk" xmlns:wne="http://schemas.microsoft.com/office/word/2006/wordml" xmlns:wps="http://schemas.microsoft.com/office/word/2010/wordprocessingShape" mc:Ignorable="w14 w15 w16se w16cid w16 w16cex w16sdtdh w16sdtfl w16du wp14">
+  <w:abstractNum w:abstractNumId="0" w15:restartNumberingAfterBreak="0">
+    <w:nsid w:val="14DB5593"/>
+    <w:multiLevelType w:val="multilevel"/>
+    <w:tmpl w:val="69E262D4"/>
+    <w:lvl w:ilvl="0">
+      <w:start w:val="1"/>
+      <w:numFmt w:val="bullet"/>
+      <w:lvlText w:val=""/>
+      <w:lvlJc w:val="left"/>
+      <w:pPr>
+        <w:tabs>
+          <w:tab w:val="num" w:pos="720"/>
+        </w:tabs>
+        <w:ind w:left="720" w:hanging="360"/>
+      </w:pPr>
+      <w:rPr>
+        <w:rFonts w:ascii="Symbol" w:hAnsi="Symbol" w:hint="default"/>
+        <w:sz w:val="20"/>
+      </w:rPr>
+    </w:lvl>
+    <w:lvl w:ilvl="1" w:tentative="1">
+      <w:start w:val="1"/>
+      <w:numFmt w:val="bullet"/>
+      <w:lvlText w:val="o"/>
+      <w:lvlJc w:val="left"/>
+      <w:pPr>
+        <w:tabs>
+          <w:tab w:val="num" w:pos="1440"/>
+        </w:tabs>
+        <w:ind w:left="1440" w:hanging="360"/>
+      </w:pPr>
+      <w:rPr>
+        <w:rFonts w:ascii="Courier New" w:hAnsi="Courier New" w:hint="default"/>
+        <w:sz w:val="20"/>
+      </w:rPr>
+    </w:lvl>
+    <w:lvl w:ilvl="2" w:tentative="1">
+      <w:start w:val="1"/>
+      <w:numFmt w:val="bullet"/>
+      <w:lvlText w:val=""/>
+      <w:lvlJc w:val="left"/>
+      <w:pPr>
+        <w:tabs>
+          <w:tab w:val="num" w:pos="2160"/>
+        </w:tabs>
+        <w:ind w:left="2160" w:hanging="360"/>
+      </w:pPr>
+      <w:rPr>
+        <w:rFonts w:ascii="Wingdings" w:hAnsi="Wingdings" w:hint="default"/>
+        <w:sz w:val="20"/>
+      </w:rPr>
+    </w:lvl>
+    <w:lvl w:ilvl="3" w:tentative="1">
+      <w:start w:val="1"/>
+      <w:numFmt w:val="bullet"/>
+      <w:lvlText w:val=""/>
+      <w:lvlJc w:val="left"/>
+      <w:pPr>
+        <w:tabs>
+          <w:tab w:val="num" w:pos="2880"/>
+        </w:tabs>
+        <w:ind w:left="2880" w:hanging="360"/>
+      </w:pPr>
+      <w:rPr>
+        <w:rFonts w:ascii="Wingdings" w:hAnsi="Wingdings" w:hint="default"/>
+        <w:sz w:val="20"/>
+      </w:rPr>
+    </w:lvl>
+    <w:lvl w:ilvl="4" w:tentative="1">
+      <w:start w:val="1"/>
+      <w:numFmt w:val="bullet"/>
+      <w:lvlText w:val=""/>
+      <w:lvlJc w:val="left"/>
+      <w:pPr>
+        <w:tabs>
+          <w:tab w:val="num" w:pos="3600"/>
+        </w:tabs>
+        <w:ind w:left="3600" w:hanging="360"/>
+      </w:pPr>
+      <w:rPr>
+        <w:rFonts w:ascii="Wingdings" w:hAnsi="Wingdings" w:hint="default"/>
+        <w:sz w:val="20"/>
+      </w:rPr>
+    </w:lvl>
+    <w:lvl w:ilvl="5" w:tentative="1">
+      <w:start w:val="1"/>
+      <w:numFmt w:val="bullet"/>
+      <w:lvlText w:val=""/>
+      <w:lvlJc w:val="left"/>
+      <w:pPr>
+        <w:tabs>
+          <w:tab w:val="num" w:pos="4320"/>
+        </w:tabs>
+        <w:ind w:left="4320" w:hanging="360"/>
+      </w:pPr>
+      <w:rPr>
+        <w:rFonts w:ascii="Wingdings" w:hAnsi="Wingdings" w:hint="default"/>
+        <w:sz w:val="20"/>
+      </w:rPr>
+    </w:lvl>
+    <w:lvl w:ilvl="6" w:tentative="1">
+      <w:start w:val="1"/>
+      <w:numFmt w:val="bullet"/>
+      <w:lvlText w:val=""/>
+      <w:lvlJc w:val="left"/>
+      <w:pPr>
+        <w:tabs>
+          <w:tab w:val="num" w:pos="5040"/>
+        </w:tabs>
+        <w:ind w:left="5040" w:hanging="360"/>
+      </w:pPr>
+      <w:rPr>
+        <w:rFonts w:ascii="Wingdings" w:hAnsi="Wingdings" w:hint="default"/>
+        <w:sz w:val="20"/>
+      </w:rPr>
+    </w:lvl>
+    <w:lvl w:ilvl="7" w:tentative="1">
+      <w:start w:val="1"/>
+      <w:numFmt w:val="bullet"/>
+      <w:lvlText w:val=""/>
+      <w:lvlJc w:val="left"/>
+      <w:pPr>
+        <w:tabs>
+          <w:tab w:val="num" w:pos="5760"/>
+        </w:tabs>
+        <w:ind w:left="5760" w:hanging="360"/>
+      </w:pPr>
+      <w:rPr>
+        <w:rFonts w:ascii="Wingdings" w:hAnsi="Wingdings" w:hint="default"/>
+        <w:sz w:val="20"/>
+      </w:rPr>
+    </w:lvl>
+    <w:lvl w:ilvl="8" w:tentative="1">
+      <w:start w:val="1"/>
+      <w:numFmt w:val="bullet"/>
+      <w:lvlText w:val=""/>
+      <w:lvlJc w:val="left"/>
+      <w:pPr>
+        <w:tabs>
+          <w:tab w:val="num" w:pos="6480"/>
+        </w:tabs>
+        <w:ind w:left="6480" w:hanging="360"/>
+      </w:pPr>
+      <w:rPr>
+        <w:rFonts w:ascii="Wingdings" w:hAnsi="Wingdings" w:hint="default"/>
+        <w:sz w:val="20"/>
+      </w:rPr>
+    </w:lvl>
+  </w:abstractNum>
+  <w:abstractNum w:abstractNumId="1" w15:restartNumberingAfterBreak="0">
+    <w:nsid w:val="16641DBC"/>
+    <w:multiLevelType w:val="multilevel"/>
+    <w:tmpl w:val="D3FC2B20"/>
+    <w:lvl w:ilvl="0">
+      <w:start w:val="1"/>
+      <w:numFmt w:val="bullet"/>
+      <w:lvlText w:val=""/>
+      <w:lvlJc w:val="left"/>
+      <w:pPr>
+        <w:tabs>
+          <w:tab w:val="num" w:pos="720"/>
+        </w:tabs>
+        <w:ind w:left="720" w:hanging="360"/>
+      </w:pPr>
+      <w:rPr>
+        <w:rFonts w:ascii="Symbol" w:hAnsi="Symbol" w:hint="default"/>
+        <w:sz w:val="20"/>
+      </w:rPr>
+    </w:lvl>
+    <w:lvl w:ilvl="1" w:tentative="1">
+      <w:start w:val="1"/>
+      <w:numFmt w:val="bullet"/>
+      <w:lvlText w:val="o"/>
+      <w:lvlJc w:val="left"/>
+      <w:pPr>
+        <w:tabs>
+          <w:tab w:val="num" w:pos="1440"/>
+        </w:tabs>
+        <w:ind w:left="1440" w:hanging="360"/>
+      </w:pPr>
+      <w:rPr>
+        <w:rFonts w:ascii="Courier New" w:hAnsi="Courier New" w:hint="default"/>
+        <w:sz w:val="20"/>
+      </w:rPr>
+    </w:lvl>
+    <w:lvl w:ilvl="2" w:tentative="1">
+      <w:start w:val="1"/>
+      <w:numFmt w:val="bullet"/>
+      <w:lvlText w:val=""/>
+      <w:lvlJc w:val="left"/>
+      <w:pPr>
+        <w:tabs>
+          <w:tab w:val="num" w:pos="2160"/>
+        </w:tabs>
+        <w:ind w:left="2160" w:hanging="360"/>
+      </w:pPr>
+      <w:rPr>
+        <w:rFonts w:ascii="Wingdings" w:hAnsi="Wingdings" w:hint="default"/>
+        <w:sz w:val="20"/>
+      </w:rPr>
+    </w:lvl>
+    <w:lvl w:ilvl="3" w:tentative="1">
+      <w:start w:val="1"/>
+      <w:numFmt w:val="bullet"/>
+      <w:lvlText w:val=""/>
+      <w:lvlJc w:val="left"/>
+      <w:pPr>
+        <w:tabs>
+          <w:tab w:val="num" w:pos="2880"/>
+        </w:tabs>
+        <w:ind w:left="2880" w:hanging="360"/>
+      </w:pPr>
+      <w:rPr>
+        <w:rFonts w:ascii="Wingdings" w:hAnsi="Wingdings" w:hint="default"/>
+        <w:sz w:val="20"/>
+      </w:rPr>
+    </w:lvl>
+    <w:lvl w:ilvl="4" w:tentative="1">
+      <w:start w:val="1"/>
+      <w:numFmt w:val="bullet"/>
+      <w:lvlText w:val=""/>
+      <w:lvlJc w:val="left"/>
+      <w:pPr>
+        <w:tabs>
+          <w:tab w:val="num" w:pos="3600"/>
+        </w:tabs>
+        <w:ind w:left="3600" w:hanging="360"/>
+      </w:pPr>
+      <w:rPr>
+        <w:rFonts w:ascii="Wingdings" w:hAnsi="Wingdings" w:hint="default"/>
+        <w:sz w:val="20"/>
+      </w:rPr>
+    </w:lvl>
+    <w:lvl w:ilvl="5" w:tentative="1">
+      <w:start w:val="1"/>
+      <w:numFmt w:val="bullet"/>
+      <w:lvlText w:val=""/>
+      <w:lvlJc w:val="left"/>
+      <w:pPr>
+        <w:tabs>
+          <w:tab w:val="num" w:pos="4320"/>
+        </w:tabs>
+        <w:ind w:left="4320" w:hanging="360"/>
+      </w:pPr>
+      <w:rPr>
+        <w:rFonts w:ascii="Wingdings" w:hAnsi="Wingdings" w:hint="default"/>
+        <w:sz w:val="20"/>
+      </w:rPr>
+    </w:lvl>
+    <w:lvl w:ilvl="6" w:tentative="1">
+      <w:start w:val="1"/>
+      <w:numFmt w:val="bullet"/>
+      <w:lvlText w:val=""/>
+      <w:lvlJc w:val="left"/>
+      <w:pPr>
+        <w:tabs>
+          <w:tab w:val="num" w:pos="5040"/>
+        </w:tabs>
+        <w:ind w:left="5040" w:hanging="360"/>
+      </w:pPr>
+      <w:rPr>
+        <w:rFonts w:ascii="Wingdings" w:hAnsi="Wingdings" w:hint="default"/>
+        <w:sz w:val="20"/>
+      </w:rPr>
+    </w:lvl>
+    <w:lvl w:ilvl="7" w:tentative="1">
+      <w:start w:val="1"/>
+      <w:numFmt w:val="bullet"/>
+      <w:lvlText w:val=""/>
+      <w:lvlJc w:val="left"/>
+      <w:pPr>
+        <w:tabs>
+          <w:tab w:val="num" w:pos="5760"/>
+        </w:tabs>
+        <w:ind w:left="5760" w:hanging="360"/>
+      </w:pPr>
+      <w:rPr>
+        <w:rFonts w:ascii="Wingdings" w:hAnsi="Wingdings" w:hint="default"/>
+        <w:sz w:val="20"/>
+      </w:rPr>
+    </w:lvl>
+    <w:lvl w:ilvl="8" w:tentative="1">
+      <w:start w:val="1"/>
+      <w:numFmt w:val="bullet"/>
+      <w:lvlText w:val=""/>
+      <w:lvlJc w:val="left"/>
+      <w:pPr>
+        <w:tabs>
+          <w:tab w:val="num" w:pos="6480"/>
+        </w:tabs>
+        <w:ind w:left="6480" w:hanging="360"/>
+      </w:pPr>
+      <w:rPr>
+        <w:rFonts w:ascii="Wingdings" w:hAnsi="Wingdings" w:hint="default"/>
+        <w:sz w:val="20"/>
+      </w:rPr>
+    </w:lvl>
+  </w:abstractNum>
+  <w:abstractNum w:abstractNumId="2" w15:restartNumberingAfterBreak="0">
+    <w:nsid w:val="36CC7B9C"/>
+    <w:multiLevelType w:val="multilevel"/>
+    <w:tmpl w:val="C93CAB10"/>
+    <w:lvl w:ilvl="0">
+      <w:start w:val="1"/>
+      <w:numFmt w:val="bullet"/>
+      <w:lvlText w:val=""/>
+      <w:lvlJc w:val="left"/>
+      <w:pPr>
+        <w:tabs>
+          <w:tab w:val="num" w:pos="720"/>
+        </w:tabs>
+        <w:ind w:left="720" w:hanging="360"/>
+      </w:pPr>
+      <w:rPr>
+        <w:rFonts w:ascii="Symbol" w:hAnsi="Symbol" w:hint="default"/>
+        <w:sz w:val="20"/>
+      </w:rPr>
+    </w:lvl>
+    <w:lvl w:ilvl="1" w:tentative="1">
+      <w:start w:val="1"/>
+      <w:numFmt w:val="bullet"/>
+      <w:lvlText w:val="o"/>
+      <w:lvlJc w:val="left"/>
+      <w:pPr>
+        <w:tabs>
+          <w:tab w:val="num" w:pos="1440"/>
+        </w:tabs>
+        <w:ind w:left="1440" w:hanging="360"/>
+      </w:pPr>
+      <w:rPr>
+        <w:rFonts w:ascii="Courier New" w:hAnsi="Courier New" w:hint="default"/>
+        <w:sz w:val="20"/>
+      </w:rPr>
+    </w:lvl>
+    <w:lvl w:ilvl="2" w:tentative="1">
+      <w:start w:val="1"/>
+      <w:numFmt w:val="bullet"/>
+      <w:lvlText w:val=""/>
+      <w:lvlJc w:val="left"/>
+      <w:pPr>
+        <w:tabs>
+          <w:tab w:val="num" w:pos="2160"/>
+        </w:tabs>
+        <w:ind w:left="2160" w:hanging="360"/>
+      </w:pPr>
+      <w:rPr>
+        <w:rFonts w:ascii="Wingdings" w:hAnsi="Wingdings" w:hint="default"/>
+        <w:sz w:val="20"/>
+      </w:rPr>
+    </w:lvl>
+    <w:lvl w:ilvl="3" w:tentative="1">
+      <w:start w:val="1"/>
+      <w:numFmt w:val="bullet"/>
+      <w:lvlText w:val=""/>
+      <w:lvlJc w:val="left"/>
+      <w:pPr>
+        <w:tabs>
+          <w:tab w:val="num" w:pos="2880"/>
+        </w:tabs>
+        <w:ind w:left="2880" w:hanging="360"/>
+      </w:pPr>
+      <w:rPr>
+        <w:rFonts w:ascii="Wingdings" w:hAnsi="Wingdings" w:hint="default"/>
+        <w:sz w:val="20"/>
+      </w:rPr>
+    </w:lvl>
+    <w:lvl w:ilvl="4" w:tentative="1">
+      <w:start w:val="1"/>
+      <w:numFmt w:val="bullet"/>
+      <w:lvlText w:val=""/>
+      <w:lvlJc w:val="left"/>
+      <w:pPr>
+        <w:tabs>
+          <w:tab w:val="num" w:pos="3600"/>
+        </w:tabs>
+        <w:ind w:left="3600" w:hanging="360"/>
+      </w:pPr>
+      <w:rPr>
+        <w:rFonts w:ascii="Wingdings" w:hAnsi="Wingdings" w:hint="default"/>
+        <w:sz w:val="20"/>
+      </w:rPr>
+    </w:lvl>
+    <w:lvl w:ilvl="5" w:tentative="1">
+      <w:start w:val="1"/>
+      <w:numFmt w:val="bullet"/>
+      <w:lvlText w:val=""/>
+      <w:lvlJc w:val="left"/>
+      <w:pPr>
+        <w:tabs>
+          <w:tab w:val="num" w:pos="4320"/>
+        </w:tabs>
+        <w:ind w:left="4320" w:hanging="360"/>
+      </w:pPr>
+      <w:rPr>
+        <w:rFonts w:ascii="Wingdings" w:hAnsi="Wingdings" w:hint="default"/>
+        <w:sz w:val="20"/>
+      </w:rPr>
+    </w:lvl>
+    <w:lvl w:ilvl="6" w:tentative="1">
+      <w:start w:val="1"/>
+      <w:numFmt w:val="bullet"/>
+      <w:lvlText w:val=""/>
+      <w:lvlJc w:val="left"/>
+      <w:pPr>
+        <w:tabs>
+          <w:tab w:val="num" w:pos="5040"/>
+        </w:tabs>
+        <w:ind w:left="5040" w:hanging="360"/>
+      </w:pPr>
+      <w:rPr>
+        <w:rFonts w:ascii="Wingdings" w:hAnsi="Wingdings" w:hint="default"/>
+        <w:sz w:val="20"/>
+      </w:rPr>
+    </w:lvl>
+    <w:lvl w:ilvl="7" w:tentative="1">
+      <w:start w:val="1"/>
+      <w:numFmt w:val="bullet"/>
+      <w:lvlText w:val=""/>
+      <w:lvlJc w:val="left"/>
+      <w:pPr>
+        <w:tabs>
+          <w:tab w:val="num" w:pos="5760"/>
+        </w:tabs>
+        <w:ind w:left="5760" w:hanging="360"/>
+      </w:pPr>
+      <w:rPr>
+        <w:rFonts w:ascii="Wingdings" w:hAnsi="Wingdings" w:hint="default"/>
+        <w:sz w:val="20"/>
+      </w:rPr>
+    </w:lvl>
+    <w:lvl w:ilvl="8" w:tentative="1">
+      <w:start w:val="1"/>
+      <w:numFmt w:val="bullet"/>
+      <w:lvlText w:val=""/>
+      <w:lvlJc w:val="left"/>
+      <w:pPr>
+        <w:tabs>
+          <w:tab w:val="num" w:pos="6480"/>
+        </w:tabs>
+        <w:ind w:left="6480" w:hanging="360"/>
+      </w:pPr>
+      <w:rPr>
+        <w:rFonts w:ascii="Wingdings" w:hAnsi="Wingdings" w:hint="default"/>
+        <w:sz w:val="20"/>
+      </w:rPr>
+    </w:lvl>
+  </w:abstractNum>
+  <w:abstractNum w:abstractNumId="3" w15:restartNumberingAfterBreak="0">
+    <w:nsid w:val="38C807C3"/>
+    <w:multiLevelType w:val="multilevel"/>
+    <w:tmpl w:val="012C3E26"/>
+    <w:lvl w:ilvl="0">
+      <w:start w:val="1"/>
+      <w:numFmt w:val="bullet"/>
+      <w:lvlText w:val=""/>
+      <w:lvlJc w:val="left"/>
+      <w:pPr>
+        <w:tabs>
+          <w:tab w:val="num" w:pos="720"/>
+        </w:tabs>
+        <w:ind w:left="720" w:hanging="360"/>
+      </w:pPr>
+      <w:rPr>
+        <w:rFonts w:ascii="Symbol" w:hAnsi="Symbol" w:hint="default"/>
+        <w:sz w:val="20"/>
+      </w:rPr>
+    </w:lvl>
+    <w:lvl w:ilvl="1" w:tentative="1">
+      <w:start w:val="1"/>
+      <w:numFmt w:val="bullet"/>
+      <w:lvlText w:val="o"/>
+      <w:lvlJc w:val="left"/>
+      <w:pPr>
+        <w:tabs>
+          <w:tab w:val="num" w:pos="1440"/>
+        </w:tabs>
+        <w:ind w:left="1440" w:hanging="360"/>
+      </w:pPr>
+      <w:rPr>
+        <w:rFonts w:ascii="Courier New" w:hAnsi="Courier New" w:hint="default"/>
+        <w:sz w:val="20"/>
+      </w:rPr>
+    </w:lvl>
+    <w:lvl w:ilvl="2" w:tentative="1">
+      <w:start w:val="1"/>
+      <w:numFmt w:val="bullet"/>
+      <w:lvlText w:val=""/>
+      <w:lvlJc w:val="left"/>
+      <w:pPr>
+        <w:tabs>
+          <w:tab w:val="num" w:pos="2160"/>
+        </w:tabs>
+        <w:ind w:left="2160" w:hanging="360"/>
+      </w:pPr>
+      <w:rPr>
+        <w:rFonts w:ascii="Wingdings" w:hAnsi="Wingdings" w:hint="default"/>
+        <w:sz w:val="20"/>
+      </w:rPr>
+    </w:lvl>
+    <w:lvl w:ilvl="3" w:tentative="1">
+      <w:start w:val="1"/>
+      <w:numFmt w:val="bullet"/>
+      <w:lvlText w:val=""/>
+      <w:lvlJc w:val="left"/>
+      <w:pPr>
+        <w:tabs>
+          <w:tab w:val="num" w:pos="2880"/>
+        </w:tabs>
+        <w:ind w:left="2880" w:hanging="360"/>
+      </w:pPr>
+      <w:rPr>
+        <w:rFonts w:ascii="Wingdings" w:hAnsi="Wingdings" w:hint="default"/>
+        <w:sz w:val="20"/>
+      </w:rPr>
+    </w:lvl>
+    <w:lvl w:ilvl="4" w:tentative="1">
+      <w:start w:val="1"/>
+      <w:numFmt w:val="bullet"/>
+      <w:lvlText w:val=""/>
+      <w:lvlJc w:val="left"/>
+      <w:pPr>
+        <w:tabs>
+          <w:tab w:val="num" w:pos="3600"/>
+        </w:tabs>
+        <w:ind w:left="3600" w:hanging="360"/>
+      </w:pPr>
+      <w:rPr>
+        <w:rFonts w:ascii="Wingdings" w:hAnsi="Wingdings" w:hint="default"/>
+        <w:sz w:val="20"/>
+      </w:rPr>
+    </w:lvl>
+    <w:lvl w:ilvl="5" w:tentative="1">
+      <w:start w:val="1"/>
+      <w:numFmt w:val="bullet"/>
+      <w:lvlText w:val=""/>
+      <w:lvlJc w:val="left"/>
+      <w:pPr>
+        <w:tabs>
+          <w:tab w:val="num" w:pos="4320"/>
+        </w:tabs>
+        <w:ind w:left="4320" w:hanging="360"/>
+      </w:pPr>
+      <w:rPr>
+        <w:rFonts w:ascii="Wingdings" w:hAnsi="Wingdings" w:hint="default"/>
+        <w:sz w:val="20"/>
+      </w:rPr>
+    </w:lvl>
+    <w:lvl w:ilvl="6" w:tentative="1">
+      <w:start w:val="1"/>
+      <w:numFmt w:val="bullet"/>
+      <w:lvlText w:val=""/>
+      <w:lvlJc w:val="left"/>
+      <w:pPr>
+        <w:tabs>
+          <w:tab w:val="num" w:pos="5040"/>
+        </w:tabs>
+        <w:ind w:left="5040" w:hanging="360"/>
+      </w:pPr>
+      <w:rPr>
+        <w:rFonts w:ascii="Wingdings" w:hAnsi="Wingdings" w:hint="default"/>
+        <w:sz w:val="20"/>
+      </w:rPr>
+    </w:lvl>
+    <w:lvl w:ilvl="7" w:tentative="1">
+      <w:start w:val="1"/>
+      <w:numFmt w:val="bullet"/>
+      <w:lvlText w:val=""/>
+      <w:lvlJc w:val="left"/>
+      <w:pPr>
+        <w:tabs>
+          <w:tab w:val="num" w:pos="5760"/>
+        </w:tabs>
+        <w:ind w:left="5760" w:hanging="360"/>
+      </w:pPr>
+      <w:rPr>
+        <w:rFonts w:ascii="Wingdings" w:hAnsi="Wingdings" w:hint="default"/>
+        <w:sz w:val="20"/>
+      </w:rPr>
+    </w:lvl>
+    <w:lvl w:ilvl="8" w:tentative="1">
+      <w:start w:val="1"/>
+      <w:numFmt w:val="bullet"/>
+      <w:lvlText w:val=""/>
+      <w:lvlJc w:val="left"/>
+      <w:pPr>
+        <w:tabs>
+          <w:tab w:val="num" w:pos="6480"/>
+        </w:tabs>
+        <w:ind w:left="6480" w:hanging="360"/>
+      </w:pPr>
+      <w:rPr>
+        <w:rFonts w:ascii="Wingdings" w:hAnsi="Wingdings" w:hint="default"/>
+        <w:sz w:val="20"/>
+      </w:rPr>
+    </w:lvl>
+  </w:abstractNum>
+  <w:abstractNum w:abstractNumId="4" w15:restartNumberingAfterBreak="0">
+    <w:nsid w:val="3B501D26"/>
+    <w:multiLevelType w:val="multilevel"/>
+    <w:tmpl w:val="E034EE52"/>
+    <w:lvl w:ilvl="0">
+      <w:start w:val="1"/>
+      <w:numFmt w:val="decimal"/>
+      <w:lvlText w:val="%1."/>
+      <w:lvlJc w:val="left"/>
+      <w:pPr>
+        <w:tabs>
+          <w:tab w:val="num" w:pos="720"/>
+        </w:tabs>
+        <w:ind w:left="720" w:hanging="360"/>
+      </w:pPr>
+    </w:lvl>
+    <w:lvl w:ilvl="1" w:tentative="1">
+      <w:start w:val="1"/>
+      <w:numFmt w:val="decimal"/>
+      <w:lvlText w:val="%2."/>
+      <w:lvlJc w:val="left"/>
+      <w:pPr>
+        <w:tabs>
+          <w:tab w:val="num" w:pos="1440"/>
+        </w:tabs>
+        <w:ind w:left="1440" w:hanging="360"/>
+      </w:pPr>
+    </w:lvl>
+    <w:lvl w:ilvl="2" w:tentative="1">
+      <w:start w:val="1"/>
+      <w:numFmt w:val="decimal"/>
+      <w:lvlText w:val="%3."/>
+      <w:lvlJc w:val="left"/>
+      <w:pPr>
+        <w:tabs>
+          <w:tab w:val="num" w:pos="2160"/>
+        </w:tabs>
+        <w:ind w:left="2160" w:hanging="360"/>
+      </w:pPr>
+    </w:lvl>
+    <w:lvl w:ilvl="3" w:tentative="1">
+      <w:start w:val="1"/>
+      <w:numFmt w:val="decimal"/>
+      <w:lvlText w:val="%4."/>
+      <w:lvlJc w:val="left"/>
+      <w:pPr>
+        <w:tabs>
+          <w:tab w:val="num" w:pos="2880"/>
+        </w:tabs>
+        <w:ind w:left="2880" w:hanging="360"/>
+      </w:pPr>
+    </w:lvl>
+    <w:lvl w:ilvl="4" w:tentative="1">
+      <w:start w:val="1"/>
+      <w:numFmt w:val="decimal"/>
+      <w:lvlText w:val="%5."/>
+      <w:lvlJc w:val="left"/>
+      <w:pPr>
+        <w:tabs>
+          <w:tab w:val="num" w:pos="3600"/>
+        </w:tabs>
+        <w:ind w:left="3600" w:hanging="360"/>
+      </w:pPr>
+    </w:lvl>
+    <w:lvl w:ilvl="5" w:tentative="1">
+      <w:start w:val="1"/>
+      <w:numFmt w:val="decimal"/>
+      <w:lvlText w:val="%6."/>
+      <w:lvlJc w:val="left"/>
+      <w:pPr>
+        <w:tabs>
+          <w:tab w:val="num" w:pos="4320"/>
+        </w:tabs>
+        <w:ind w:left="4320" w:hanging="360"/>
+      </w:pPr>
+    </w:lvl>
+    <w:lvl w:ilvl="6" w:tentative="1">
+      <w:start w:val="1"/>
+      <w:numFmt w:val="decimal"/>
+      <w:lvlText w:val="%7."/>
+      <w:lvlJc w:val="left"/>
+      <w:pPr>
+        <w:tabs>
+          <w:tab w:val="num" w:pos="5040"/>
+        </w:tabs>
+        <w:ind w:left="5040" w:hanging="360"/>
+      </w:pPr>
+    </w:lvl>
+    <w:lvl w:ilvl="7" w:tentative="1">
+      <w:start w:val="1"/>
+      <w:numFmt w:val="decimal"/>
+      <w:lvlText w:val="%8."/>
+      <w:lvlJc w:val="left"/>
+      <w:pPr>
+        <w:tabs>
+          <w:tab w:val="num" w:pos="5760"/>
+        </w:tabs>
+        <w:ind w:left="5760" w:hanging="360"/>
+      </w:pPr>
+    </w:lvl>
+    <w:lvl w:ilvl="8" w:tentative="1">
+      <w:start w:val="1"/>
+      <w:numFmt w:val="decimal"/>
+      <w:lvlText w:val="%9."/>
+      <w:lvlJc w:val="left"/>
+      <w:pPr>
+        <w:tabs>
+          <w:tab w:val="num" w:pos="6480"/>
+        </w:tabs>
+        <w:ind w:left="6480" w:hanging="360"/>
+      </w:pPr>
+    </w:lvl>
+  </w:abstractNum>
+  <w:abstractNum w:abstractNumId="5" w15:restartNumberingAfterBreak="0">
+    <w:nsid w:val="41011256"/>
+    <w:multiLevelType w:val="multilevel"/>
+    <w:tmpl w:val="273CA5C0"/>
+    <w:lvl w:ilvl="0">
+      <w:start w:val="1"/>
+      <w:numFmt w:val="decimal"/>
+      <w:lvlText w:val="%1."/>
+      <w:lvlJc w:val="left"/>
+      <w:pPr>
+        <w:tabs>
+          <w:tab w:val="num" w:pos="720"/>
+        </w:tabs>
+        <w:ind w:left="720" w:hanging="360"/>
+      </w:pPr>
+    </w:lvl>
+    <w:lvl w:ilvl="1">
+      <w:start w:val="1"/>
+      <w:numFmt w:val="bullet"/>
+      <w:lvlText w:val="o"/>
+      <w:lvlJc w:val="left"/>
+      <w:pPr>
+        <w:tabs>
+          <w:tab w:val="num" w:pos="1440"/>
+        </w:tabs>
+        <w:ind w:left="1440" w:hanging="360"/>
+      </w:pPr>
+      <w:rPr>
+        <w:rFonts w:ascii="Courier New" w:hAnsi="Courier New" w:hint="default"/>
+        <w:sz w:val="20"/>
+      </w:rPr>
+    </w:lvl>
+    <w:lvl w:ilvl="2" w:tentative="1">
+      <w:start w:val="1"/>
+      <w:numFmt w:val="decimal"/>
+      <w:lvlText w:val="%3."/>
+      <w:lvlJc w:val="left"/>
+      <w:pPr>
+        <w:tabs>
+          <w:tab w:val="num" w:pos="2160"/>
+        </w:tabs>
+        <w:ind w:left="2160" w:hanging="360"/>
+      </w:pPr>
+    </w:lvl>
+    <w:lvl w:ilvl="3" w:tentative="1">
+      <w:start w:val="1"/>
+      <w:numFmt w:val="decimal"/>
+      <w:lvlText w:val="%4."/>
+      <w:lvlJc w:val="left"/>
+      <w:pPr>
+        <w:tabs>
+          <w:tab w:val="num" w:pos="2880"/>
+        </w:tabs>
+        <w:ind w:left="2880" w:hanging="360"/>
+      </w:pPr>
+    </w:lvl>
+    <w:lvl w:ilvl="4" w:tentative="1">
+      <w:start w:val="1"/>
+      <w:numFmt w:val="decimal"/>
+      <w:lvlText w:val="%5."/>
+      <w:lvlJc w:val="left"/>
+      <w:pPr>
+        <w:tabs>
+          <w:tab w:val="num" w:pos="3600"/>
+        </w:tabs>
+        <w:ind w:left="3600" w:hanging="360"/>
+      </w:pPr>
+    </w:lvl>
+    <w:lvl w:ilvl="5" w:tentative="1">
+      <w:start w:val="1"/>
+      <w:numFmt w:val="decimal"/>
+      <w:lvlText w:val="%6."/>
+      <w:lvlJc w:val="left"/>
+      <w:pPr>
+        <w:tabs>
+          <w:tab w:val="num" w:pos="4320"/>
+        </w:tabs>
+        <w:ind w:left="4320" w:hanging="360"/>
+      </w:pPr>
+    </w:lvl>
+    <w:lvl w:ilvl="6" w:tentative="1">
+      <w:start w:val="1"/>
+      <w:numFmt w:val="decimal"/>
+      <w:lvlText w:val="%7."/>
+      <w:lvlJc w:val="left"/>
+      <w:pPr>
+        <w:tabs>
+          <w:tab w:val="num" w:pos="5040"/>
+        </w:tabs>
+        <w:ind w:left="5040" w:hanging="360"/>
+      </w:pPr>
+    </w:lvl>
+    <w:lvl w:ilvl="7" w:tentative="1">
+      <w:start w:val="1"/>
+      <w:numFmt w:val="decimal"/>
+      <w:lvlText w:val="%8."/>
+      <w:lvlJc w:val="left"/>
+      <w:pPr>
+        <w:tabs>
+          <w:tab w:val="num" w:pos="5760"/>
+        </w:tabs>
+        <w:ind w:left="5760" w:hanging="360"/>
+      </w:pPr>
+    </w:lvl>
+    <w:lvl w:ilvl="8" w:tentative="1">
+      <w:start w:val="1"/>
+      <w:numFmt w:val="decimal"/>
+      <w:lvlText w:val="%9."/>
+      <w:lvlJc w:val="left"/>
+      <w:pPr>
+        <w:tabs>
+          <w:tab w:val="num" w:pos="6480"/>
+        </w:tabs>
+        <w:ind w:left="6480" w:hanging="360"/>
+      </w:pPr>
+    </w:lvl>
+  </w:abstractNum>
+  <w:abstractNum w:abstractNumId="6" w15:restartNumberingAfterBreak="0">
+    <w:nsid w:val="4268528A"/>
+    <w:multiLevelType w:val="multilevel"/>
+    <w:tmpl w:val="79FE8742"/>
+    <w:lvl w:ilvl="0">
+      <w:start w:val="1"/>
+      <w:numFmt w:val="decimal"/>
+      <w:lvlText w:val="%1."/>
+      <w:lvlJc w:val="left"/>
+      <w:pPr>
+        <w:tabs>
+          <w:tab w:val="num" w:pos="720"/>
+        </w:tabs>
+        <w:ind w:left="720" w:hanging="360"/>
+      </w:pPr>
+    </w:lvl>
+    <w:lvl w:ilvl="1">
+      <w:start w:val="1"/>
+      <w:numFmt w:val="bullet"/>
+      <w:lvlText w:val="o"/>
+      <w:lvlJc w:val="left"/>
+      <w:pPr>
+        <w:tabs>
+          <w:tab w:val="num" w:pos="1440"/>
+        </w:tabs>
+        <w:ind w:left="1440" w:hanging="360"/>
+      </w:pPr>
+      <w:rPr>
+        <w:rFonts w:ascii="Courier New" w:hAnsi="Courier New" w:hint="default"/>
+        <w:sz w:val="20"/>
+      </w:rPr>
+    </w:lvl>
+    <w:lvl w:ilvl="2" w:tentative="1">
+      <w:start w:val="1"/>
+      <w:numFmt w:val="decimal"/>
+      <w:lvlText w:val="%3."/>
+      <w:lvlJc w:val="left"/>
+      <w:pPr>
+        <w:tabs>
+          <w:tab w:val="num" w:pos="2160"/>
+        </w:tabs>
+        <w:ind w:left="2160" w:hanging="360"/>
+      </w:pPr>
+    </w:lvl>
+    <w:lvl w:ilvl="3" w:tentative="1">
+      <w:start w:val="1"/>
+      <w:numFmt w:val="decimal"/>
+      <w:lvlText w:val="%4."/>
+      <w:lvlJc w:val="left"/>
+      <w:pPr>
+        <w:tabs>
+          <w:tab w:val="num" w:pos="2880"/>
+        </w:tabs>
+        <w:ind w:left="2880" w:hanging="360"/>
+      </w:pPr>
+    </w:lvl>
+    <w:lvl w:ilvl="4" w:tentative="1">
+      <w:start w:val="1"/>
+      <w:numFmt w:val="decimal"/>
+      <w:lvlText w:val="%5."/>
+      <w:lvlJc w:val="left"/>
+      <w:pPr>
+        <w:tabs>
+          <w:tab w:val="num" w:pos="3600"/>
+        </w:tabs>
+        <w:ind w:left="3600" w:hanging="360"/>
+      </w:pPr>
+    </w:lvl>
+    <w:lvl w:ilvl="5" w:tentative="1">
+      <w:start w:val="1"/>
+      <w:numFmt w:val="decimal"/>
+      <w:lvlText w:val="%6."/>
+      <w:lvlJc w:val="left"/>
+      <w:pPr>
+        <w:tabs>
+          <w:tab w:val="num" w:pos="4320"/>
+        </w:tabs>
+        <w:ind w:left="4320" w:hanging="360"/>
+      </w:pPr>
+    </w:lvl>
+    <w:lvl w:ilvl="6" w:tentative="1">
+      <w:start w:val="1"/>
+      <w:numFmt w:val="decimal"/>
+      <w:lvlText w:val="%7."/>
+      <w:lvlJc w:val="left"/>
+      <w:pPr>
+        <w:tabs>
+          <w:tab w:val="num" w:pos="5040"/>
+        </w:tabs>
+        <w:ind w:left="5040" w:hanging="360"/>
+      </w:pPr>
+    </w:lvl>
+    <w:lvl w:ilvl="7" w:tentative="1">
+      <w:start w:val="1"/>
+      <w:numFmt w:val="decimal"/>
+      <w:lvlText w:val="%8."/>
+      <w:lvlJc w:val="left"/>
+      <w:pPr>
+        <w:tabs>
+          <w:tab w:val="num" w:pos="5760"/>
+        </w:tabs>
+        <w:ind w:left="5760" w:hanging="360"/>
+      </w:pPr>
+    </w:lvl>
+    <w:lvl w:ilvl="8" w:tentative="1">
+      <w:start w:val="1"/>
+      <w:numFmt w:val="decimal"/>
+      <w:lvlText w:val="%9."/>
+      <w:lvlJc w:val="left"/>
+      <w:pPr>
+        <w:tabs>
+          <w:tab w:val="num" w:pos="6480"/>
+        </w:tabs>
+        <w:ind w:left="6480" w:hanging="360"/>
+      </w:pPr>
+    </w:lvl>
+  </w:abstractNum>
+  <w:abstractNum w:abstractNumId="7" w15:restartNumberingAfterBreak="0">
+    <w:nsid w:val="428369C7"/>
+    <w:multiLevelType w:val="multilevel"/>
+    <w:tmpl w:val="B0763BAE"/>
+    <w:lvl w:ilvl="0">
+      <w:start w:val="1"/>
+      <w:numFmt w:val="bullet"/>
+      <w:lvlText w:val=""/>
+      <w:lvlJc w:val="left"/>
+      <w:pPr>
+        <w:tabs>
+          <w:tab w:val="num" w:pos="720"/>
+        </w:tabs>
+        <w:ind w:left="720" w:hanging="360"/>
+      </w:pPr>
+      <w:rPr>
+        <w:rFonts w:ascii="Symbol" w:hAnsi="Symbol" w:hint="default"/>
+        <w:sz w:val="20"/>
+      </w:rPr>
+    </w:lvl>
+    <w:lvl w:ilvl="1" w:tentative="1">
+      <w:start w:val="1"/>
+      <w:numFmt w:val="bullet"/>
+      <w:lvlText w:val="o"/>
+      <w:lvlJc w:val="left"/>
+      <w:pPr>
+        <w:tabs>
+          <w:tab w:val="num" w:pos="1440"/>
+        </w:tabs>
+        <w:ind w:left="1440" w:hanging="360"/>
+      </w:pPr>
+      <w:rPr>
+        <w:rFonts w:ascii="Courier New" w:hAnsi="Courier New" w:hint="default"/>
+        <w:sz w:val="20"/>
+      </w:rPr>
+    </w:lvl>
+    <w:lvl w:ilvl="2" w:tentative="1">
+      <w:start w:val="1"/>
+      <w:numFmt w:val="bullet"/>
+      <w:lvlText w:val=""/>
+      <w:lvlJc w:val="left"/>
+      <w:pPr>
+        <w:tabs>
+          <w:tab w:val="num" w:pos="2160"/>
+        </w:tabs>
+        <w:ind w:left="2160" w:hanging="360"/>
+      </w:pPr>
+      <w:rPr>
+        <w:rFonts w:ascii="Wingdings" w:hAnsi="Wingdings" w:hint="default"/>
+        <w:sz w:val="20"/>
+      </w:rPr>
+    </w:lvl>
+    <w:lvl w:ilvl="3" w:tentative="1">
+      <w:start w:val="1"/>
+      <w:numFmt w:val="bullet"/>
+      <w:lvlText w:val=""/>
+      <w:lvlJc w:val="left"/>
+      <w:pPr>
+        <w:tabs>
+          <w:tab w:val="num" w:pos="2880"/>
+        </w:tabs>
+        <w:ind w:left="2880" w:hanging="360"/>
+      </w:pPr>
+      <w:rPr>
+        <w:rFonts w:ascii="Wingdings" w:hAnsi="Wingdings" w:hint="default"/>
+        <w:sz w:val="20"/>
+      </w:rPr>
+    </w:lvl>
+    <w:lvl w:ilvl="4" w:tentative="1">
+      <w:start w:val="1"/>
+      <w:numFmt w:val="bullet"/>
+      <w:lvlText w:val=""/>
+      <w:lvlJc w:val="left"/>
+      <w:pPr>
+        <w:tabs>
+          <w:tab w:val="num" w:pos="3600"/>
+        </w:tabs>
+        <w:ind w:left="3600" w:hanging="360"/>
+      </w:pPr>
+      <w:rPr>
+        <w:rFonts w:ascii="Wingdings" w:hAnsi="Wingdings" w:hint="default"/>
+        <w:sz w:val="20"/>
+      </w:rPr>
+    </w:lvl>
+    <w:lvl w:ilvl="5" w:tentative="1">
+      <w:start w:val="1"/>
+      <w:numFmt w:val="bullet"/>
+      <w:lvlText w:val=""/>
+      <w:lvlJc w:val="left"/>
+      <w:pPr>
+        <w:tabs>
+          <w:tab w:val="num" w:pos="4320"/>
+        </w:tabs>
+        <w:ind w:left="4320" w:hanging="360"/>
+      </w:pPr>
+      <w:rPr>
+        <w:rFonts w:ascii="Wingdings" w:hAnsi="Wingdings" w:hint="default"/>
+        <w:sz w:val="20"/>
+      </w:rPr>
+    </w:lvl>
+    <w:lvl w:ilvl="6" w:tentative="1">
+      <w:start w:val="1"/>
+      <w:numFmt w:val="bullet"/>
+      <w:lvlText w:val=""/>
+      <w:lvlJc w:val="left"/>
+      <w:pPr>
+        <w:tabs>
+          <w:tab w:val="num" w:pos="5040"/>
+        </w:tabs>
+        <w:ind w:left="5040" w:hanging="360"/>
+      </w:pPr>
+      <w:rPr>
+        <w:rFonts w:ascii="Wingdings" w:hAnsi="Wingdings" w:hint="default"/>
+        <w:sz w:val="20"/>
+      </w:rPr>
+    </w:lvl>
+    <w:lvl w:ilvl="7" w:tentative="1">
+      <w:start w:val="1"/>
+      <w:numFmt w:val="bullet"/>
+      <w:lvlText w:val=""/>
+      <w:lvlJc w:val="left"/>
+      <w:pPr>
+        <w:tabs>
+          <w:tab w:val="num" w:pos="5760"/>
+        </w:tabs>
+        <w:ind w:left="5760" w:hanging="360"/>
+      </w:pPr>
+      <w:rPr>
+        <w:rFonts w:ascii="Wingdings" w:hAnsi="Wingdings" w:hint="default"/>
+        <w:sz w:val="20"/>
+      </w:rPr>
+    </w:lvl>
+    <w:lvl w:ilvl="8" w:tentative="1">
+      <w:start w:val="1"/>
+      <w:numFmt w:val="bullet"/>
+      <w:lvlText w:val=""/>
+      <w:lvlJc w:val="left"/>
+      <w:pPr>
+        <w:tabs>
+          <w:tab w:val="num" w:pos="6480"/>
+        </w:tabs>
+        <w:ind w:left="6480" w:hanging="360"/>
+      </w:pPr>
+      <w:rPr>
+        <w:rFonts w:ascii="Wingdings" w:hAnsi="Wingdings" w:hint="default"/>
+        <w:sz w:val="20"/>
+      </w:rPr>
+    </w:lvl>
+  </w:abstractNum>
+  <w:abstractNum w:abstractNumId="8" w15:restartNumberingAfterBreak="0">
+    <w:nsid w:val="52391C08"/>
+    <w:multiLevelType w:val="multilevel"/>
+    <w:tmpl w:val="0F06B192"/>
+    <w:lvl w:ilvl="0">
+      <w:start w:val="1"/>
+      <w:numFmt w:val="bullet"/>
+      <w:lvlText w:val=""/>
+      <w:lvlJc w:val="left"/>
+      <w:pPr>
+        <w:tabs>
+          <w:tab w:val="num" w:pos="720"/>
+        </w:tabs>
+        <w:ind w:left="720" w:hanging="360"/>
+      </w:pPr>
+      <w:rPr>
+        <w:rFonts w:ascii="Symbol" w:hAnsi="Symbol" w:hint="default"/>
+        <w:sz w:val="20"/>
+      </w:rPr>
+    </w:lvl>
+    <w:lvl w:ilvl="1" w:tentative="1">
+      <w:start w:val="1"/>
+      <w:numFmt w:val="bullet"/>
+      <w:lvlText w:val="o"/>
+      <w:lvlJc w:val="left"/>
+      <w:pPr>
+        <w:tabs>
+          <w:tab w:val="num" w:pos="1440"/>
+        </w:tabs>
+        <w:ind w:left="1440" w:hanging="360"/>
+      </w:pPr>
+      <w:rPr>
+        <w:rFonts w:ascii="Courier New" w:hAnsi="Courier New" w:hint="default"/>
+        <w:sz w:val="20"/>
+      </w:rPr>
+    </w:lvl>
+    <w:lvl w:ilvl="2" w:tentative="1">
+      <w:start w:val="1"/>
+      <w:numFmt w:val="bullet"/>
+      <w:lvlText w:val=""/>
+      <w:lvlJc w:val="left"/>
+      <w:pPr>
+        <w:tabs>
+          <w:tab w:val="num" w:pos="2160"/>
+        </w:tabs>
+        <w:ind w:left="2160" w:hanging="360"/>
+      </w:pPr>
+      <w:rPr>
+        <w:rFonts w:ascii="Wingdings" w:hAnsi="Wingdings" w:hint="default"/>
+        <w:sz w:val="20"/>
+      </w:rPr>
+    </w:lvl>
+    <w:lvl w:ilvl="3" w:tentative="1">
+      <w:start w:val="1"/>
+      <w:numFmt w:val="bullet"/>
+      <w:lvlText w:val=""/>
+      <w:lvlJc w:val="left"/>
+      <w:pPr>
+        <w:tabs>
+          <w:tab w:val="num" w:pos="2880"/>
+        </w:tabs>
+        <w:ind w:left="2880" w:hanging="360"/>
+      </w:pPr>
+      <w:rPr>
+        <w:rFonts w:ascii="Wingdings" w:hAnsi="Wingdings" w:hint="default"/>
+        <w:sz w:val="20"/>
+      </w:rPr>
+    </w:lvl>
+    <w:lvl w:ilvl="4" w:tentative="1">
+      <w:start w:val="1"/>
+      <w:numFmt w:val="bullet"/>
+      <w:lvlText w:val=""/>
+      <w:lvlJc w:val="left"/>
+      <w:pPr>
+        <w:tabs>
+          <w:tab w:val="num" w:pos="3600"/>
+        </w:tabs>
+        <w:ind w:left="3600" w:hanging="360"/>
+      </w:pPr>
+      <w:rPr>
+        <w:rFonts w:ascii="Wingdings" w:hAnsi="Wingdings" w:hint="default"/>
+        <w:sz w:val="20"/>
+      </w:rPr>
+    </w:lvl>
+    <w:lvl w:ilvl="5" w:tentative="1">
+      <w:start w:val="1"/>
+      <w:numFmt w:val="bullet"/>
+      <w:lvlText w:val=""/>
+      <w:lvlJc w:val="left"/>
+      <w:pPr>
+        <w:tabs>
+          <w:tab w:val="num" w:pos="4320"/>
+        </w:tabs>
+        <w:ind w:left="4320" w:hanging="360"/>
+      </w:pPr>
+      <w:rPr>
+        <w:rFonts w:ascii="Wingdings" w:hAnsi="Wingdings" w:hint="default"/>
+        <w:sz w:val="20"/>
+      </w:rPr>
+    </w:lvl>
+    <w:lvl w:ilvl="6" w:tentative="1">
+      <w:start w:val="1"/>
+      <w:numFmt w:val="bullet"/>
+      <w:lvlText w:val=""/>
+      <w:lvlJc w:val="left"/>
+      <w:pPr>
+        <w:tabs>
+          <w:tab w:val="num" w:pos="5040"/>
+        </w:tabs>
+        <w:ind w:left="5040" w:hanging="360"/>
+      </w:pPr>
+      <w:rPr>
+        <w:rFonts w:ascii="Wingdings" w:hAnsi="Wingdings" w:hint="default"/>
+        <w:sz w:val="20"/>
+      </w:rPr>
+    </w:lvl>
+    <w:lvl w:ilvl="7" w:tentative="1">
+      <w:start w:val="1"/>
+      <w:numFmt w:val="bullet"/>
+      <w:lvlText w:val=""/>
+      <w:lvlJc w:val="left"/>
+      <w:pPr>
+        <w:tabs>
+          <w:tab w:val="num" w:pos="5760"/>
+        </w:tabs>
+        <w:ind w:left="5760" w:hanging="360"/>
+      </w:pPr>
+      <w:rPr>
+        <w:rFonts w:ascii="Wingdings" w:hAnsi="Wingdings" w:hint="default"/>
+        <w:sz w:val="20"/>
+      </w:rPr>
+    </w:lvl>
+    <w:lvl w:ilvl="8" w:tentative="1">
+      <w:start w:val="1"/>
+      <w:numFmt w:val="bullet"/>
+      <w:lvlText w:val=""/>
+      <w:lvlJc w:val="left"/>
+      <w:pPr>
+        <w:tabs>
+          <w:tab w:val="num" w:pos="6480"/>
+        </w:tabs>
+        <w:ind w:left="6480" w:hanging="360"/>
+      </w:pPr>
+      <w:rPr>
+        <w:rFonts w:ascii="Wingdings" w:hAnsi="Wingdings" w:hint="default"/>
+        <w:sz w:val="20"/>
+      </w:rPr>
+    </w:lvl>
+  </w:abstractNum>
+  <w:abstractNum w:abstractNumId="9" w15:restartNumberingAfterBreak="0">
+    <w:nsid w:val="569F5FAC"/>
+    <w:multiLevelType w:val="multilevel"/>
+    <w:tmpl w:val="4262004C"/>
+    <w:lvl w:ilvl="0">
+      <w:start w:val="1"/>
+      <w:numFmt w:val="bullet"/>
+      <w:lvlText w:val=""/>
+      <w:lvlJc w:val="left"/>
+      <w:pPr>
+        <w:tabs>
+          <w:tab w:val="num" w:pos="720"/>
+        </w:tabs>
+        <w:ind w:left="720" w:hanging="360"/>
+      </w:pPr>
+      <w:rPr>
+        <w:rFonts w:ascii="Symbol" w:hAnsi="Symbol" w:hint="default"/>
+        <w:sz w:val="20"/>
+      </w:rPr>
+    </w:lvl>
+    <w:lvl w:ilvl="1" w:tentative="1">
+      <w:start w:val="1"/>
+      <w:numFmt w:val="bullet"/>
+      <w:lvlText w:val="o"/>
+      <w:lvlJc w:val="left"/>
+      <w:pPr>
+        <w:tabs>
+          <w:tab w:val="num" w:pos="1440"/>
+        </w:tabs>
+        <w:ind w:left="1440" w:hanging="360"/>
+      </w:pPr>
+      <w:rPr>
+        <w:rFonts w:ascii="Courier New" w:hAnsi="Courier New" w:hint="default"/>
+        <w:sz w:val="20"/>
+      </w:rPr>
+    </w:lvl>
+    <w:lvl w:ilvl="2" w:tentative="1">
+      <w:start w:val="1"/>
+      <w:numFmt w:val="bullet"/>
+      <w:lvlText w:val=""/>
+      <w:lvlJc w:val="left"/>
+      <w:pPr>
+        <w:tabs>
+          <w:tab w:val="num" w:pos="2160"/>
+        </w:tabs>
+        <w:ind w:left="2160" w:hanging="360"/>
+      </w:pPr>
+      <w:rPr>
+        <w:rFonts w:ascii="Wingdings" w:hAnsi="Wingdings" w:hint="default"/>
+        <w:sz w:val="20"/>
+      </w:rPr>
+    </w:lvl>
+    <w:lvl w:ilvl="3" w:tentative="1">
+      <w:start w:val="1"/>
+      <w:numFmt w:val="bullet"/>
+      <w:lvlText w:val=""/>
+      <w:lvlJc w:val="left"/>
+      <w:pPr>
+        <w:tabs>
+          <w:tab w:val="num" w:pos="2880"/>
+        </w:tabs>
+        <w:ind w:left="2880" w:hanging="360"/>
+      </w:pPr>
+      <w:rPr>
+        <w:rFonts w:ascii="Wingdings" w:hAnsi="Wingdings" w:hint="default"/>
+        <w:sz w:val="20"/>
+      </w:rPr>
+    </w:lvl>
+    <w:lvl w:ilvl="4" w:tentative="1">
+      <w:start w:val="1"/>
+      <w:numFmt w:val="bullet"/>
+      <w:lvlText w:val=""/>
+      <w:lvlJc w:val="left"/>
+      <w:pPr>
+        <w:tabs>
+          <w:tab w:val="num" w:pos="3600"/>
+        </w:tabs>
+        <w:ind w:left="3600" w:hanging="360"/>
+      </w:pPr>
+      <w:rPr>
+        <w:rFonts w:ascii="Wingdings" w:hAnsi="Wingdings" w:hint="default"/>
+        <w:sz w:val="20"/>
+      </w:rPr>
+    </w:lvl>
+    <w:lvl w:ilvl="5" w:tentative="1">
+      <w:start w:val="1"/>
+      <w:numFmt w:val="bullet"/>
+      <w:lvlText w:val=""/>
+      <w:lvlJc w:val="left"/>
+      <w:pPr>
+        <w:tabs>
+          <w:tab w:val="num" w:pos="4320"/>
+        </w:tabs>
+        <w:ind w:left="4320" w:hanging="360"/>
+      </w:pPr>
+      <w:rPr>
+        <w:rFonts w:ascii="Wingdings" w:hAnsi="Wingdings" w:hint="default"/>
+        <w:sz w:val="20"/>
+      </w:rPr>
+    </w:lvl>
+    <w:lvl w:ilvl="6" w:tentative="1">
+      <w:start w:val="1"/>
+      <w:numFmt w:val="bullet"/>
+      <w:lvlText w:val=""/>
+      <w:lvlJc w:val="left"/>
+      <w:pPr>
+        <w:tabs>
+          <w:tab w:val="num" w:pos="5040"/>
+        </w:tabs>
+        <w:ind w:left="5040" w:hanging="360"/>
+      </w:pPr>
+      <w:rPr>
+        <w:rFonts w:ascii="Wingdings" w:hAnsi="Wingdings" w:hint="default"/>
+        <w:sz w:val="20"/>
+      </w:rPr>
+    </w:lvl>
+    <w:lvl w:ilvl="7" w:tentative="1">
+      <w:start w:val="1"/>
+      <w:numFmt w:val="bullet"/>
+      <w:lvlText w:val=""/>
+      <w:lvlJc w:val="left"/>
+      <w:pPr>
+        <w:tabs>
+          <w:tab w:val="num" w:pos="5760"/>
+        </w:tabs>
+        <w:ind w:left="5760" w:hanging="360"/>
+      </w:pPr>
+      <w:rPr>
+        <w:rFonts w:ascii="Wingdings" w:hAnsi="Wingdings" w:hint="default"/>
+        <w:sz w:val="20"/>
+      </w:rPr>
+    </w:lvl>
+    <w:lvl w:ilvl="8" w:tentative="1">
+      <w:start w:val="1"/>
+      <w:numFmt w:val="bullet"/>
+      <w:lvlText w:val=""/>
+      <w:lvlJc w:val="left"/>
+      <w:pPr>
+        <w:tabs>
+          <w:tab w:val="num" w:pos="6480"/>
+        </w:tabs>
+        <w:ind w:left="6480" w:hanging="360"/>
+      </w:pPr>
+      <w:rPr>
+        <w:rFonts w:ascii="Wingdings" w:hAnsi="Wingdings" w:hint="default"/>
+        <w:sz w:val="20"/>
+      </w:rPr>
+    </w:lvl>
+  </w:abstractNum>
+  <w:abstractNum w:abstractNumId="10" w15:restartNumberingAfterBreak="0">
+    <w:nsid w:val="5E4F3C02"/>
+    <w:multiLevelType w:val="multilevel"/>
+    <w:tmpl w:val="B03EDD1A"/>
+    <w:lvl w:ilvl="0">
+      <w:start w:val="1"/>
+      <w:numFmt w:val="bullet"/>
+      <w:lvlText w:val=""/>
+      <w:lvlJc w:val="left"/>
+      <w:pPr>
+        <w:tabs>
+          <w:tab w:val="num" w:pos="720"/>
+        </w:tabs>
+        <w:ind w:left="720" w:hanging="360"/>
+      </w:pPr>
+      <w:rPr>
+        <w:rFonts w:ascii="Symbol" w:hAnsi="Symbol" w:hint="default"/>
+        <w:sz w:val="20"/>
+      </w:rPr>
+    </w:lvl>
+    <w:lvl w:ilvl="1" w:tentative="1">
+      <w:start w:val="1"/>
+      <w:numFmt w:val="bullet"/>
+      <w:lvlText w:val="o"/>
+      <w:lvlJc w:val="left"/>
+      <w:pPr>
+        <w:tabs>
+          <w:tab w:val="num" w:pos="1440"/>
+        </w:tabs>
+        <w:ind w:left="1440" w:hanging="360"/>
+      </w:pPr>
+      <w:rPr>
+        <w:rFonts w:ascii="Courier New" w:hAnsi="Courier New" w:hint="default"/>
+        <w:sz w:val="20"/>
+      </w:rPr>
+    </w:lvl>
+    <w:lvl w:ilvl="2" w:tentative="1">
+      <w:start w:val="1"/>
+      <w:numFmt w:val="bullet"/>
+      <w:lvlText w:val=""/>
+      <w:lvlJc w:val="left"/>
+      <w:pPr>
+        <w:tabs>
+          <w:tab w:val="num" w:pos="2160"/>
+        </w:tabs>
+        <w:ind w:left="2160" w:hanging="360"/>
+      </w:pPr>
+      <w:rPr>
+        <w:rFonts w:ascii="Wingdings" w:hAnsi="Wingdings" w:hint="default"/>
+        <w:sz w:val="20"/>
+      </w:rPr>
+    </w:lvl>
+    <w:lvl w:ilvl="3" w:tentative="1">
+      <w:start w:val="1"/>
+      <w:numFmt w:val="bullet"/>
+      <w:lvlText w:val=""/>
+      <w:lvlJc w:val="left"/>
+      <w:pPr>
+        <w:tabs>
+          <w:tab w:val="num" w:pos="2880"/>
+        </w:tabs>
+        <w:ind w:left="2880" w:hanging="360"/>
+      </w:pPr>
+      <w:rPr>
+        <w:rFonts w:ascii="Wingdings" w:hAnsi="Wingdings" w:hint="default"/>
+        <w:sz w:val="20"/>
+      </w:rPr>
+    </w:lvl>
+    <w:lvl w:ilvl="4" w:tentative="1">
+      <w:start w:val="1"/>
+      <w:numFmt w:val="bullet"/>
+      <w:lvlText w:val=""/>
+      <w:lvlJc w:val="left"/>
+      <w:pPr>
+        <w:tabs>
+          <w:tab w:val="num" w:pos="3600"/>
+        </w:tabs>
+        <w:ind w:left="3600" w:hanging="360"/>
+      </w:pPr>
+      <w:rPr>
+        <w:rFonts w:ascii="Wingdings" w:hAnsi="Wingdings" w:hint="default"/>
+        <w:sz w:val="20"/>
+      </w:rPr>
+    </w:lvl>
+    <w:lvl w:ilvl="5" w:tentative="1">
+      <w:start w:val="1"/>
+      <w:numFmt w:val="bullet"/>
+      <w:lvlText w:val=""/>
+      <w:lvlJc w:val="left"/>
+      <w:pPr>
+        <w:tabs>
+          <w:tab w:val="num" w:pos="4320"/>
+        </w:tabs>
+        <w:ind w:left="4320" w:hanging="360"/>
+      </w:pPr>
+      <w:rPr>
+        <w:rFonts w:ascii="Wingdings" w:hAnsi="Wingdings" w:hint="default"/>
+        <w:sz w:val="20"/>
+      </w:rPr>
+    </w:lvl>
+    <w:lvl w:ilvl="6" w:tentative="1">
+      <w:start w:val="1"/>
+      <w:numFmt w:val="bullet"/>
+      <w:lvlText w:val=""/>
+      <w:lvlJc w:val="left"/>
+      <w:pPr>
+        <w:tabs>
+          <w:tab w:val="num" w:pos="5040"/>
+        </w:tabs>
+        <w:ind w:left="5040" w:hanging="360"/>
+      </w:pPr>
+      <w:rPr>
+        <w:rFonts w:ascii="Wingdings" w:hAnsi="Wingdings" w:hint="default"/>
+        <w:sz w:val="20"/>
+      </w:rPr>
+    </w:lvl>
+    <w:lvl w:ilvl="7" w:tentative="1">
+      <w:start w:val="1"/>
+      <w:numFmt w:val="bullet"/>
+      <w:lvlText w:val=""/>
+      <w:lvlJc w:val="left"/>
+      <w:pPr>
+        <w:tabs>
+          <w:tab w:val="num" w:pos="5760"/>
+        </w:tabs>
+        <w:ind w:left="5760" w:hanging="360"/>
+      </w:pPr>
+      <w:rPr>
+        <w:rFonts w:ascii="Wingdings" w:hAnsi="Wingdings" w:hint="default"/>
+        <w:sz w:val="20"/>
+      </w:rPr>
+    </w:lvl>
+    <w:lvl w:ilvl="8" w:tentative="1">
+      <w:start w:val="1"/>
+      <w:numFmt w:val="bullet"/>
+      <w:lvlText w:val=""/>
+      <w:lvlJc w:val="left"/>
+      <w:pPr>
+        <w:tabs>
+          <w:tab w:val="num" w:pos="6480"/>
+        </w:tabs>
+        <w:ind w:left="6480" w:hanging="360"/>
+      </w:pPr>
+      <w:rPr>
+        <w:rFonts w:ascii="Wingdings" w:hAnsi="Wingdings" w:hint="default"/>
+        <w:sz w:val="20"/>
+      </w:rPr>
+    </w:lvl>
+  </w:abstractNum>
+  <w:abstractNum w:abstractNumId="11" w15:restartNumberingAfterBreak="0">
+    <w:nsid w:val="62CC6B16"/>
+    <w:multiLevelType w:val="multilevel"/>
+    <w:tmpl w:val="FC863EB2"/>
+    <w:lvl w:ilvl="0">
+      <w:start w:val="1"/>
+      <w:numFmt w:val="bullet"/>
+      <w:lvlText w:val=""/>
+      <w:lvlJc w:val="left"/>
+      <w:pPr>
+        <w:tabs>
+          <w:tab w:val="num" w:pos="720"/>
+        </w:tabs>
+        <w:ind w:left="720" w:hanging="360"/>
+      </w:pPr>
+      <w:rPr>
+        <w:rFonts w:ascii="Symbol" w:hAnsi="Symbol" w:hint="default"/>
+        <w:sz w:val="20"/>
+      </w:rPr>
+    </w:lvl>
+    <w:lvl w:ilvl="1" w:tentative="1">
+      <w:start w:val="1"/>
+      <w:numFmt w:val="bullet"/>
+      <w:lvlText w:val="o"/>
+      <w:lvlJc w:val="left"/>
+      <w:pPr>
+        <w:tabs>
+          <w:tab w:val="num" w:pos="1440"/>
+        </w:tabs>
+        <w:ind w:left="1440" w:hanging="360"/>
+      </w:pPr>
+      <w:rPr>
+        <w:rFonts w:ascii="Courier New" w:hAnsi="Courier New" w:hint="default"/>
+        <w:sz w:val="20"/>
+      </w:rPr>
+    </w:lvl>
+    <w:lvl w:ilvl="2" w:tentative="1">
+      <w:start w:val="1"/>
+      <w:numFmt w:val="bullet"/>
+      <w:lvlText w:val=""/>
+      <w:lvlJc w:val="left"/>
+      <w:pPr>
+        <w:tabs>
+          <w:tab w:val="num" w:pos="2160"/>
+        </w:tabs>
+        <w:ind w:left="2160" w:hanging="360"/>
+      </w:pPr>
+      <w:rPr>
+        <w:rFonts w:ascii="Wingdings" w:hAnsi="Wingdings" w:hint="default"/>
+        <w:sz w:val="20"/>
+      </w:rPr>
+    </w:lvl>
+    <w:lvl w:ilvl="3" w:tentative="1">
+      <w:start w:val="1"/>
+      <w:numFmt w:val="bullet"/>
+      <w:lvlText w:val=""/>
+      <w:lvlJc w:val="left"/>
+      <w:pPr>
+        <w:tabs>
+          <w:tab w:val="num" w:pos="2880"/>
+        </w:tabs>
+        <w:ind w:left="2880" w:hanging="360"/>
+      </w:pPr>
+      <w:rPr>
+        <w:rFonts w:ascii="Wingdings" w:hAnsi="Wingdings" w:hint="default"/>
+        <w:sz w:val="20"/>
+      </w:rPr>
+    </w:lvl>
+    <w:lvl w:ilvl="4" w:tentative="1">
+      <w:start w:val="1"/>
+      <w:numFmt w:val="bullet"/>
+      <w:lvlText w:val=""/>
+      <w:lvlJc w:val="left"/>
+      <w:pPr>
+        <w:tabs>
+          <w:tab w:val="num" w:pos="3600"/>
+        </w:tabs>
+        <w:ind w:left="3600" w:hanging="360"/>
+      </w:pPr>
+      <w:rPr>
+        <w:rFonts w:ascii="Wingdings" w:hAnsi="Wingdings" w:hint="default"/>
+        <w:sz w:val="20"/>
+      </w:rPr>
+    </w:lvl>
+    <w:lvl w:ilvl="5" w:tentative="1">
+      <w:start w:val="1"/>
+      <w:numFmt w:val="bullet"/>
+      <w:lvlText w:val=""/>
+      <w:lvlJc w:val="left"/>
+      <w:pPr>
+        <w:tabs>
+          <w:tab w:val="num" w:pos="4320"/>
+        </w:tabs>
+        <w:ind w:left="4320" w:hanging="360"/>
+      </w:pPr>
+      <w:rPr>
+        <w:rFonts w:ascii="Wingdings" w:hAnsi="Wingdings" w:hint="default"/>
+        <w:sz w:val="20"/>
+      </w:rPr>
+    </w:lvl>
+    <w:lvl w:ilvl="6" w:tentative="1">
+      <w:start w:val="1"/>
+      <w:numFmt w:val="bullet"/>
+      <w:lvlText w:val=""/>
+      <w:lvlJc w:val="left"/>
+      <w:pPr>
+        <w:tabs>
+          <w:tab w:val="num" w:pos="5040"/>
+        </w:tabs>
+        <w:ind w:left="5040" w:hanging="360"/>
+      </w:pPr>
+      <w:rPr>
+        <w:rFonts w:ascii="Wingdings" w:hAnsi="Wingdings" w:hint="default"/>
+        <w:sz w:val="20"/>
+      </w:rPr>
+    </w:lvl>
+    <w:lvl w:ilvl="7" w:tentative="1">
+      <w:start w:val="1"/>
+      <w:numFmt w:val="bullet"/>
+      <w:lvlText w:val=""/>
+      <w:lvlJc w:val="left"/>
+      <w:pPr>
+        <w:tabs>
+          <w:tab w:val="num" w:pos="5760"/>
+        </w:tabs>
+        <w:ind w:left="5760" w:hanging="360"/>
+      </w:pPr>
+      <w:rPr>
+        <w:rFonts w:ascii="Wingdings" w:hAnsi="Wingdings" w:hint="default"/>
+        <w:sz w:val="20"/>
+      </w:rPr>
+    </w:lvl>
+    <w:lvl w:ilvl="8" w:tentative="1">
+      <w:start w:val="1"/>
+      <w:numFmt w:val="bullet"/>
+      <w:lvlText w:val=""/>
+      <w:lvlJc w:val="left"/>
+      <w:pPr>
+        <w:tabs>
+          <w:tab w:val="num" w:pos="6480"/>
+        </w:tabs>
+        <w:ind w:left="6480" w:hanging="360"/>
+      </w:pPr>
+      <w:rPr>
+        <w:rFonts w:ascii="Wingdings" w:hAnsi="Wingdings" w:hint="default"/>
+        <w:sz w:val="20"/>
+      </w:rPr>
+    </w:lvl>
+  </w:abstractNum>
+  <w:abstractNum w:abstractNumId="12" w15:restartNumberingAfterBreak="0">
+    <w:nsid w:val="6E7B4058"/>
+    <w:multiLevelType w:val="multilevel"/>
+    <w:tmpl w:val="49DC0830"/>
+    <w:lvl w:ilvl="0">
+      <w:start w:val="1"/>
+      <w:numFmt w:val="bullet"/>
+      <w:lvlText w:val=""/>
+      <w:lvlJc w:val="left"/>
+      <w:pPr>
+        <w:tabs>
+          <w:tab w:val="num" w:pos="720"/>
+        </w:tabs>
+        <w:ind w:left="720" w:hanging="360"/>
+      </w:pPr>
+      <w:rPr>
+        <w:rFonts w:ascii="Symbol" w:hAnsi="Symbol" w:hint="default"/>
+        <w:sz w:val="20"/>
+      </w:rPr>
+    </w:lvl>
+    <w:lvl w:ilvl="1" w:tentative="1">
+      <w:start w:val="1"/>
+      <w:numFmt w:val="bullet"/>
+      <w:lvlText w:val="o"/>
+      <w:lvlJc w:val="left"/>
+      <w:pPr>
+        <w:tabs>
+          <w:tab w:val="num" w:pos="1440"/>
+        </w:tabs>
+        <w:ind w:left="1440" w:hanging="360"/>
+      </w:pPr>
+      <w:rPr>
+        <w:rFonts w:ascii="Courier New" w:hAnsi="Courier New" w:hint="default"/>
+        <w:sz w:val="20"/>
+      </w:rPr>
+    </w:lvl>
+    <w:lvl w:ilvl="2" w:tentative="1">
+      <w:start w:val="1"/>
+      <w:numFmt w:val="bullet"/>
+      <w:lvlText w:val=""/>
+      <w:lvlJc w:val="left"/>
+      <w:pPr>
+        <w:tabs>
+          <w:tab w:val="num" w:pos="2160"/>
+        </w:tabs>
+        <w:ind w:left="2160" w:hanging="360"/>
+      </w:pPr>
+      <w:rPr>
+        <w:rFonts w:ascii="Wingdings" w:hAnsi="Wingdings" w:hint="default"/>
+        <w:sz w:val="20"/>
+      </w:rPr>
+    </w:lvl>
+    <w:lvl w:ilvl="3" w:tentative="1">
+      <w:start w:val="1"/>
+      <w:numFmt w:val="bullet"/>
+      <w:lvlText w:val=""/>
+      <w:lvlJc w:val="left"/>
+      <w:pPr>
+        <w:tabs>
+          <w:tab w:val="num" w:pos="2880"/>
+        </w:tabs>
+        <w:ind w:left="2880" w:hanging="360"/>
+      </w:pPr>
+      <w:rPr>
+        <w:rFonts w:ascii="Wingdings" w:hAnsi="Wingdings" w:hint="default"/>
+        <w:sz w:val="20"/>
+      </w:rPr>
+    </w:lvl>
+    <w:lvl w:ilvl="4" w:tentative="1">
+      <w:start w:val="1"/>
+      <w:numFmt w:val="bullet"/>
+      <w:lvlText w:val=""/>
+      <w:lvlJc w:val="left"/>
+      <w:pPr>
+        <w:tabs>
+          <w:tab w:val="num" w:pos="3600"/>
+        </w:tabs>
+        <w:ind w:left="3600" w:hanging="360"/>
+      </w:pPr>
+      <w:rPr>
+        <w:rFonts w:ascii="Wingdings" w:hAnsi="Wingdings" w:hint="default"/>
+        <w:sz w:val="20"/>
+      </w:rPr>
+    </w:lvl>
+    <w:lvl w:ilvl="5" w:tentative="1">
+      <w:start w:val="1"/>
+      <w:numFmt w:val="bullet"/>
+      <w:lvlText w:val=""/>
+      <w:lvlJc w:val="left"/>
+      <w:pPr>
+        <w:tabs>
+          <w:tab w:val="num" w:pos="4320"/>
+        </w:tabs>
+        <w:ind w:left="4320" w:hanging="360"/>
+      </w:pPr>
+      <w:rPr>
+        <w:rFonts w:ascii="Wingdings" w:hAnsi="Wingdings" w:hint="default"/>
+        <w:sz w:val="20"/>
+      </w:rPr>
+    </w:lvl>
+    <w:lvl w:ilvl="6" w:tentative="1">
+      <w:start w:val="1"/>
+      <w:numFmt w:val="bullet"/>
+      <w:lvlText w:val=""/>
+      <w:lvlJc w:val="left"/>
+      <w:pPr>
+        <w:tabs>
+          <w:tab w:val="num" w:pos="5040"/>
+        </w:tabs>
+        <w:ind w:left="5040" w:hanging="360"/>
+      </w:pPr>
+      <w:rPr>
+        <w:rFonts w:ascii="Wingdings" w:hAnsi="Wingdings" w:hint="default"/>
+        <w:sz w:val="20"/>
+      </w:rPr>
+    </w:lvl>
+    <w:lvl w:ilvl="7" w:tentative="1">
+      <w:start w:val="1"/>
+      <w:numFmt w:val="bullet"/>
+      <w:lvlText w:val=""/>
+      <w:lvlJc w:val="left"/>
+      <w:pPr>
+        <w:tabs>
+          <w:tab w:val="num" w:pos="5760"/>
+        </w:tabs>
+        <w:ind w:left="5760" w:hanging="360"/>
+      </w:pPr>
+      <w:rPr>
+        <w:rFonts w:ascii="Wingdings" w:hAnsi="Wingdings" w:hint="default"/>
+        <w:sz w:val="20"/>
+      </w:rPr>
+    </w:lvl>
+    <w:lvl w:ilvl="8" w:tentative="1">
+      <w:start w:val="1"/>
+      <w:numFmt w:val="bullet"/>
+      <w:lvlText w:val=""/>
+      <w:lvlJc w:val="left"/>
+      <w:pPr>
+        <w:tabs>
+          <w:tab w:val="num" w:pos="6480"/>
+        </w:tabs>
+        <w:ind w:left="6480" w:hanging="360"/>
+      </w:pPr>
+      <w:rPr>
+        <w:rFonts w:ascii="Wingdings" w:hAnsi="Wingdings" w:hint="default"/>
+        <w:sz w:val="20"/>
+      </w:rPr>
+    </w:lvl>
+  </w:abstractNum>
+  <w:abstractNum w:abstractNumId="13" w15:restartNumberingAfterBreak="0">
+    <w:nsid w:val="706C3E15"/>
+    <w:multiLevelType w:val="multilevel"/>
+    <w:tmpl w:val="B4965642"/>
+    <w:lvl w:ilvl="0">
+      <w:start w:val="1"/>
+      <w:numFmt w:val="decimal"/>
+      <w:lvlText w:val="%1."/>
+      <w:lvlJc w:val="left"/>
+      <w:pPr>
+        <w:tabs>
+          <w:tab w:val="num" w:pos="720"/>
+        </w:tabs>
+        <w:ind w:left="720" w:hanging="360"/>
+      </w:pPr>
+    </w:lvl>
+    <w:lvl w:ilvl="1" w:tentative="1">
+      <w:start w:val="1"/>
+      <w:numFmt w:val="decimal"/>
+      <w:lvlText w:val="%2."/>
+      <w:lvlJc w:val="left"/>
+      <w:pPr>
+        <w:tabs>
+          <w:tab w:val="num" w:pos="1440"/>
+        </w:tabs>
+        <w:ind w:left="1440" w:hanging="360"/>
+      </w:pPr>
+    </w:lvl>
+    <w:lvl w:ilvl="2" w:tentative="1">
+      <w:start w:val="1"/>
+      <w:numFmt w:val="decimal"/>
+      <w:lvlText w:val="%3."/>
+      <w:lvlJc w:val="left"/>
+      <w:pPr>
+        <w:tabs>
+          <w:tab w:val="num" w:pos="2160"/>
+        </w:tabs>
+        <w:ind w:left="2160" w:hanging="360"/>
+      </w:pPr>
+    </w:lvl>
+    <w:lvl w:ilvl="3" w:tentative="1">
+      <w:start w:val="1"/>
+      <w:numFmt w:val="decimal"/>
+      <w:lvlText w:val="%4."/>
+      <w:lvlJc w:val="left"/>
+      <w:pPr>
+        <w:tabs>
+          <w:tab w:val="num" w:pos="2880"/>
+        </w:tabs>
+        <w:ind w:left="2880" w:hanging="360"/>
+      </w:pPr>
+    </w:lvl>
+    <w:lvl w:ilvl="4" w:tentative="1">
+      <w:start w:val="1"/>
+      <w:numFmt w:val="decimal"/>
+      <w:lvlText w:val="%5."/>
+      <w:lvlJc w:val="left"/>
+      <w:pPr>
+        <w:tabs>
+          <w:tab w:val="num" w:pos="3600"/>
+        </w:tabs>
+        <w:ind w:left="3600" w:hanging="360"/>
+      </w:pPr>
+    </w:lvl>
+    <w:lvl w:ilvl="5" w:tentative="1">
+      <w:start w:val="1"/>
+      <w:numFmt w:val="decimal"/>
+      <w:lvlText w:val="%6."/>
+      <w:lvlJc w:val="left"/>
+      <w:pPr>
+        <w:tabs>
+          <w:tab w:val="num" w:pos="4320"/>
+        </w:tabs>
+        <w:ind w:left="4320" w:hanging="360"/>
+      </w:pPr>
+    </w:lvl>
+    <w:lvl w:ilvl="6" w:tentative="1">
+      <w:start w:val="1"/>
+      <w:numFmt w:val="decimal"/>
+      <w:lvlText w:val="%7."/>
+      <w:lvlJc w:val="left"/>
+      <w:pPr>
+        <w:tabs>
+          <w:tab w:val="num" w:pos="5040"/>
+        </w:tabs>
+        <w:ind w:left="5040" w:hanging="360"/>
+      </w:pPr>
+    </w:lvl>
+    <w:lvl w:ilvl="7" w:tentative="1">
+      <w:start w:val="1"/>
+      <w:numFmt w:val="decimal"/>
+      <w:lvlText w:val="%8."/>
+      <w:lvlJc w:val="left"/>
+      <w:pPr>
+        <w:tabs>
+          <w:tab w:val="num" w:pos="5760"/>
+        </w:tabs>
+        <w:ind w:left="5760" w:hanging="360"/>
+      </w:pPr>
+    </w:lvl>
+    <w:lvl w:ilvl="8" w:tentative="1">
+      <w:start w:val="1"/>
+      <w:numFmt w:val="decimal"/>
+      <w:lvlText w:val="%9."/>
+      <w:lvlJc w:val="left"/>
+      <w:pPr>
+        <w:tabs>
+          <w:tab w:val="num" w:pos="6480"/>
+        </w:tabs>
+        <w:ind w:left="6480" w:hanging="360"/>
+      </w:pPr>
+    </w:lvl>
+  </w:abstractNum>
+  <w:abstractNum w:abstractNumId="14" w15:restartNumberingAfterBreak="0">
+    <w:nsid w:val="7A6A08C6"/>
+    <w:multiLevelType w:val="multilevel"/>
+    <w:tmpl w:val="AB263E66"/>
+    <w:lvl w:ilvl="0">
+      <w:start w:val="1"/>
+      <w:numFmt w:val="bullet"/>
+      <w:lvlText w:val=""/>
+      <w:lvlJc w:val="left"/>
+      <w:pPr>
+        <w:tabs>
+          <w:tab w:val="num" w:pos="720"/>
+        </w:tabs>
+        <w:ind w:left="720" w:hanging="360"/>
+      </w:pPr>
+      <w:rPr>
+        <w:rFonts w:ascii="Symbol" w:hAnsi="Symbol" w:hint="default"/>
+        <w:sz w:val="20"/>
+      </w:rPr>
+    </w:lvl>
+    <w:lvl w:ilvl="1" w:tentative="1">
+      <w:start w:val="1"/>
+      <w:numFmt w:val="bullet"/>
+      <w:lvlText w:val="o"/>
+      <w:lvlJc w:val="left"/>
+      <w:pPr>
+        <w:tabs>
+          <w:tab w:val="num" w:pos="1440"/>
+        </w:tabs>
+        <w:ind w:left="1440" w:hanging="360"/>
+      </w:pPr>
+      <w:rPr>
+        <w:rFonts w:ascii="Courier New" w:hAnsi="Courier New" w:hint="default"/>
+        <w:sz w:val="20"/>
+      </w:rPr>
+    </w:lvl>
+    <w:lvl w:ilvl="2" w:tentative="1">
+      <w:start w:val="1"/>
+      <w:numFmt w:val="bullet"/>
+      <w:lvlText w:val=""/>
+      <w:lvlJc w:val="left"/>
+      <w:pPr>
+        <w:tabs>
+          <w:tab w:val="num" w:pos="2160"/>
+        </w:tabs>
+        <w:ind w:left="2160" w:hanging="360"/>
+      </w:pPr>
+      <w:rPr>
+        <w:rFonts w:ascii="Wingdings" w:hAnsi="Wingdings" w:hint="default"/>
+        <w:sz w:val="20"/>
+      </w:rPr>
+    </w:lvl>
+    <w:lvl w:ilvl="3" w:tentative="1">
+      <w:start w:val="1"/>
+      <w:numFmt w:val="bullet"/>
+      <w:lvlText w:val=""/>
+      <w:lvlJc w:val="left"/>
+      <w:pPr>
+        <w:tabs>
+          <w:tab w:val="num" w:pos="2880"/>
+        </w:tabs>
+        <w:ind w:left="2880" w:hanging="360"/>
+      </w:pPr>
+      <w:rPr>
+        <w:rFonts w:ascii="Wingdings" w:hAnsi="Wingdings" w:hint="default"/>
+        <w:sz w:val="20"/>
+      </w:rPr>
+    </w:lvl>
+    <w:lvl w:ilvl="4" w:tentative="1">
+      <w:start w:val="1"/>
+      <w:numFmt w:val="bullet"/>
+      <w:lvlText w:val=""/>
+      <w:lvlJc w:val="left"/>
+      <w:pPr>
+        <w:tabs>
+          <w:tab w:val="num" w:pos="3600"/>
+        </w:tabs>
+        <w:ind w:left="3600" w:hanging="360"/>
+      </w:pPr>
+      <w:rPr>
+        <w:rFonts w:ascii="Wingdings" w:hAnsi="Wingdings" w:hint="default"/>
+        <w:sz w:val="20"/>
+      </w:rPr>
+    </w:lvl>
+    <w:lvl w:ilvl="5" w:tentative="1">
+      <w:start w:val="1"/>
+      <w:numFmt w:val="bullet"/>
+      <w:lvlText w:val=""/>
+      <w:lvlJc w:val="left"/>
+      <w:pPr>
+        <w:tabs>
+          <w:tab w:val="num" w:pos="4320"/>
+        </w:tabs>
+        <w:ind w:left="4320" w:hanging="360"/>
+      </w:pPr>
+      <w:rPr>
+        <w:rFonts w:ascii="Wingdings" w:hAnsi="Wingdings" w:hint="default"/>
+        <w:sz w:val="20"/>
+      </w:rPr>
+    </w:lvl>
+    <w:lvl w:ilvl="6" w:tentative="1">
+      <w:start w:val="1"/>
+      <w:numFmt w:val="bullet"/>
+      <w:lvlText w:val=""/>
+      <w:lvlJc w:val="left"/>
+      <w:pPr>
+        <w:tabs>
+          <w:tab w:val="num" w:pos="5040"/>
+        </w:tabs>
+        <w:ind w:left="5040" w:hanging="360"/>
+      </w:pPr>
+      <w:rPr>
+        <w:rFonts w:ascii="Wingdings" w:hAnsi="Wingdings" w:hint="default"/>
+        <w:sz w:val="20"/>
+      </w:rPr>
+    </w:lvl>
+    <w:lvl w:ilvl="7" w:tentative="1">
+      <w:start w:val="1"/>
+      <w:numFmt w:val="bullet"/>
+      <w:lvlText w:val=""/>
+      <w:lvlJc w:val="left"/>
+      <w:pPr>
+        <w:tabs>
+          <w:tab w:val="num" w:pos="5760"/>
+        </w:tabs>
+        <w:ind w:left="5760" w:hanging="360"/>
+      </w:pPr>
+      <w:rPr>
+        <w:rFonts w:ascii="Wingdings" w:hAnsi="Wingdings" w:hint="default"/>
+        <w:sz w:val="20"/>
+      </w:rPr>
+    </w:lvl>
+    <w:lvl w:ilvl="8" w:tentative="1">
+      <w:start w:val="1"/>
+      <w:numFmt w:val="bullet"/>
+      <w:lvlText w:val=""/>
+      <w:lvlJc w:val="left"/>
+      <w:pPr>
+        <w:tabs>
+          <w:tab w:val="num" w:pos="6480"/>
+        </w:tabs>
+        <w:ind w:left="6480" w:hanging="360"/>
+      </w:pPr>
+      <w:rPr>
+        <w:rFonts w:ascii="Wingdings" w:hAnsi="Wingdings" w:hint="default"/>
+        <w:sz w:val="20"/>
+      </w:rPr>
+    </w:lvl>
+  </w:abstractNum>
+  <w:abstractNum w:abstractNumId="15" w15:restartNumberingAfterBreak="0">
+    <w:nsid w:val="7BA7762D"/>
+    <w:multiLevelType w:val="multilevel"/>
+    <w:tmpl w:val="EF60C450"/>
+    <w:lvl w:ilvl="0">
+      <w:start w:val="1"/>
+      <w:numFmt w:val="bullet"/>
+      <w:lvlText w:val=""/>
+      <w:lvlJc w:val="left"/>
+      <w:pPr>
+        <w:tabs>
+          <w:tab w:val="num" w:pos="720"/>
+        </w:tabs>
+        <w:ind w:left="720" w:hanging="360"/>
+      </w:pPr>
+      <w:rPr>
+        <w:rFonts w:ascii="Symbol" w:hAnsi="Symbol" w:hint="default"/>
+        <w:sz w:val="20"/>
+      </w:rPr>
+    </w:lvl>
+    <w:lvl w:ilvl="1" w:tentative="1">
+      <w:start w:val="1"/>
+      <w:numFmt w:val="bullet"/>
+      <w:lvlText w:val="o"/>
+      <w:lvlJc w:val="left"/>
+      <w:pPr>
+        <w:tabs>
+          <w:tab w:val="num" w:pos="1440"/>
+        </w:tabs>
+        <w:ind w:left="1440" w:hanging="360"/>
+      </w:pPr>
+      <w:rPr>
+        <w:rFonts w:ascii="Courier New" w:hAnsi="Courier New" w:hint="default"/>
+        <w:sz w:val="20"/>
+      </w:rPr>
+    </w:lvl>
+    <w:lvl w:ilvl="2" w:tentative="1">
+      <w:start w:val="1"/>
+      <w:numFmt w:val="bullet"/>
+      <w:lvlText w:val=""/>
+      <w:lvlJc w:val="left"/>
+      <w:pPr>
+        <w:tabs>
+          <w:tab w:val="num" w:pos="2160"/>
+        </w:tabs>
+        <w:ind w:left="2160" w:hanging="360"/>
+      </w:pPr>
+      <w:rPr>
+        <w:rFonts w:ascii="Wingdings" w:hAnsi="Wingdings" w:hint="default"/>
+        <w:sz w:val="20"/>
+      </w:rPr>
+    </w:lvl>
+    <w:lvl w:ilvl="3" w:tentative="1">
+      <w:start w:val="1"/>
+      <w:numFmt w:val="bullet"/>
+      <w:lvlText w:val=""/>
+      <w:lvlJc w:val="left"/>
+      <w:pPr>
+        <w:tabs>
+          <w:tab w:val="num" w:pos="2880"/>
+        </w:tabs>
+        <w:ind w:left="2880" w:hanging="360"/>
+      </w:pPr>
+      <w:rPr>
+        <w:rFonts w:ascii="Wingdings" w:hAnsi="Wingdings" w:hint="default"/>
+        <w:sz w:val="20"/>
+      </w:rPr>
+    </w:lvl>
+    <w:lvl w:ilvl="4" w:tentative="1">
+      <w:start w:val="1"/>
+      <w:numFmt w:val="bullet"/>
+      <w:lvlText w:val=""/>
+      <w:lvlJc w:val="left"/>
+      <w:pPr>
+        <w:tabs>
+          <w:tab w:val="num" w:pos="3600"/>
+        </w:tabs>
+        <w:ind w:left="3600" w:hanging="360"/>
+      </w:pPr>
+      <w:rPr>
+        <w:rFonts w:ascii="Wingdings" w:hAnsi="Wingdings" w:hint="default"/>
+        <w:sz w:val="20"/>
+      </w:rPr>
+    </w:lvl>
+    <w:lvl w:ilvl="5" w:tentative="1">
+      <w:start w:val="1"/>
+      <w:numFmt w:val="bullet"/>
+      <w:lvlText w:val=""/>
+      <w:lvlJc w:val="left"/>
+      <w:pPr>
+        <w:tabs>
+          <w:tab w:val="num" w:pos="4320"/>
+        </w:tabs>
+        <w:ind w:left="4320" w:hanging="360"/>
+      </w:pPr>
+      <w:rPr>
+        <w:rFonts w:ascii="Wingdings" w:hAnsi="Wingdings" w:hint="default"/>
+        <w:sz w:val="20"/>
+      </w:rPr>
+    </w:lvl>
+    <w:lvl w:ilvl="6" w:tentative="1">
+      <w:start w:val="1"/>
+      <w:numFmt w:val="bullet"/>
+      <w:lvlText w:val=""/>
+      <w:lvlJc w:val="left"/>
+      <w:pPr>
+        <w:tabs>
+          <w:tab w:val="num" w:pos="5040"/>
+        </w:tabs>
+        <w:ind w:left="5040" w:hanging="360"/>
+      </w:pPr>
+      <w:rPr>
+        <w:rFonts w:ascii="Wingdings" w:hAnsi="Wingdings" w:hint="default"/>
+        <w:sz w:val="20"/>
+      </w:rPr>
+    </w:lvl>
+    <w:lvl w:ilvl="7" w:tentative="1">
+      <w:start w:val="1"/>
+      <w:numFmt w:val="bullet"/>
+      <w:lvlText w:val=""/>
+      <w:lvlJc w:val="left"/>
+      <w:pPr>
+        <w:tabs>
+          <w:tab w:val="num" w:pos="5760"/>
+        </w:tabs>
+        <w:ind w:left="5760" w:hanging="360"/>
+      </w:pPr>
+      <w:rPr>
+        <w:rFonts w:ascii="Wingdings" w:hAnsi="Wingdings" w:hint="default"/>
+        <w:sz w:val="20"/>
+      </w:rPr>
+    </w:lvl>
+    <w:lvl w:ilvl="8" w:tentative="1">
+      <w:start w:val="1"/>
+      <w:numFmt w:val="bullet"/>
+      <w:lvlText w:val=""/>
+      <w:lvlJc w:val="left"/>
+      <w:pPr>
+        <w:tabs>
+          <w:tab w:val="num" w:pos="6480"/>
+        </w:tabs>
+        <w:ind w:left="6480" w:hanging="360"/>
+      </w:pPr>
+      <w:rPr>
+        <w:rFonts w:ascii="Wingdings" w:hAnsi="Wingdings" w:hint="default"/>
+        <w:sz w:val="20"/>
+      </w:rPr>
+    </w:lvl>
+  </w:abstractNum>
+  <w:num w:numId="1" w16cid:durableId="1261451865">
+    <w:abstractNumId w:val="6"/>
+  </w:num>
+  <w:num w:numId="2" w16cid:durableId="1485658564">
+    <w:abstractNumId w:val="1"/>
+  </w:num>
+  <w:num w:numId="3" w16cid:durableId="1326543865">
+    <w:abstractNumId w:val="13"/>
+  </w:num>
+  <w:num w:numId="4" w16cid:durableId="1103183345">
+    <w:abstractNumId w:val="4"/>
+  </w:num>
+  <w:num w:numId="5" w16cid:durableId="1840845016">
+    <w:abstractNumId w:val="0"/>
+  </w:num>
+  <w:num w:numId="6" w16cid:durableId="1893955217">
+    <w:abstractNumId w:val="8"/>
+  </w:num>
+  <w:num w:numId="7" w16cid:durableId="1956138388">
+    <w:abstractNumId w:val="15"/>
+  </w:num>
+  <w:num w:numId="8" w16cid:durableId="1098411375">
+    <w:abstractNumId w:val="12"/>
+  </w:num>
+  <w:num w:numId="9" w16cid:durableId="384837216">
+    <w:abstractNumId w:val="14"/>
+  </w:num>
+  <w:num w:numId="10" w16cid:durableId="1977442500">
+    <w:abstractNumId w:val="10"/>
+  </w:num>
+  <w:num w:numId="11" w16cid:durableId="311449567">
+    <w:abstractNumId w:val="5"/>
+  </w:num>
+  <w:num w:numId="12" w16cid:durableId="1281452370">
+    <w:abstractNumId w:val="11"/>
+  </w:num>
+  <w:num w:numId="13" w16cid:durableId="1880781039">
+    <w:abstractNumId w:val="7"/>
+  </w:num>
+  <w:num w:numId="14" w16cid:durableId="1449855834">
+    <w:abstractNumId w:val="9"/>
+  </w:num>
+  <w:num w:numId="15" w16cid:durableId="1323121115">
+    <w:abstractNumId w:val="3"/>
+  </w:num>
+  <w:num w:numId="16" w16cid:durableId="2014330152">
+    <w:abstractNumId w:val="2"/>
+  </w:num>
+</w:numbering>
 </file>
 
 <file path=word/styles.xml><?xml version="1.0" encoding="utf-8"?>
@@ -3084,7 +7796,6 @@
   <w:style w:type="character" w:default="1" w:styleId="DefaultParagraphFont">
     <w:name w:val="Default Paragraph Font"/>
     <w:uiPriority w:val="1"/>
-    <w:semiHidden/>
     <w:unhideWhenUsed/>
   </w:style>
   <w:style w:type="table" w:default="1" w:styleId="TableNormal">

</xml_diff>